<commit_message>
Deploy preview for PR 23 🛫
</commit_message>
<xml_diff>
--- a/pr-preview/pr-23/vignettes/articles/using-ettbc.docx
+++ b/pr-preview/pr-23/vignettes/articles/using-ettbc.docx
@@ -4643,7 +4643,7 @@
               <w:t xml:space="preserve"> </w:t>
             </w:r>
             <w:r>
-              <w:t xml:space="preserve">by the clone-censor step. In a complete analysis,</w:t>
+              <w:t xml:space="preserve">by the clone-censor step. The rest of this article applies</w:t>
             </w:r>
             <w:r>
               <w:t xml:space="preserve"> </w:t>
@@ -4653,7 +4653,7 @@
                 <w:b/>
                 <w:bCs/>
               </w:rPr>
-              <w:t xml:space="preserve">inverse probability</w:t>
+              <w:t xml:space="preserve">inverse</w:t>
             </w:r>
             <w:r>
               <w:rPr>
@@ -4667,19 +4667,25 @@
                 <w:b/>
                 <w:bCs/>
               </w:rPr>
-              <w:t xml:space="preserve">weights</w:t>
+              <w:t xml:space="preserve">probability weights</w:t>
             </w:r>
             <w:r>
               <w:t xml:space="preserve"> </w:t>
             </w:r>
             <w:r>
-              <w:t xml:space="preserve">(IPW) would be applied to correct for the different censoring</w:t>
+              <w:t xml:space="preserve">(IPW) to correct for the different censoring mechanisms</w:t>
             </w:r>
             <w:r>
               <w:t xml:space="preserve"> </w:t>
             </w:r>
             <w:r>
-              <w:t xml:space="preserve">mechanisms in each arm. See</w:t>
+              <w:t xml:space="preserve">in each arm, then fits the weighted outcome model and bootstraps a confidence</w:t>
+            </w:r>
+            <w:r>
+              <w:t xml:space="preserve"> </w:t>
+            </w:r>
+            <w:r>
+              <w:t xml:space="preserve">interval. See</w:t>
             </w:r>
             <w:r>
               <w:t xml:space="preserve"> </w:t>
@@ -4691,13 +4697,7 @@
               <w:t xml:space="preserve"> </w:t>
             </w:r>
             <w:r>
-              <w:t xml:space="preserve">for the full</w:t>
-            </w:r>
-            <w:r>
-              <w:t xml:space="preserve"> </w:t>
-            </w:r>
-            <w:r>
-              <w:t xml:space="preserve">weighted analysis.</w:t>
+              <w:t xml:space="preserve">for the full analysis on the real cohort.</w:t>
             </w:r>
           </w:p>
           <w:p/>
@@ -4705,13 +4705,13 @@
       </w:tr>
     </w:tbl>
     <w:bookmarkEnd w:id="32"/>
-    <w:bookmarkStart w:id="34" w:name="summary"/>
+    <w:bookmarkStart w:id="33" w:name="a-larger-simulated-cohort"/>
     <w:p>
       <w:pPr>
         <w:pStyle w:val="Heading2"/>
       </w:pPr>
       <w:r>
-        <w:t xml:space="preserve">6 Summary</w:t>
+        <w:t xml:space="preserve">6 A Larger Simulated Cohort</w:t>
       </w:r>
     </w:p>
     <w:p>
@@ -4719,7 +4719,25 @@
         <w:pStyle w:val="FirstParagraph"/>
       </w:pPr>
       <w:r>
-        <w:t xml:space="preserve">The</w:t>
+        <w:t xml:space="preserve">The 100-participant dataset above is convenient for showing the data</w:t>
+      </w:r>
+      <w:r>
+        <w:t xml:space="preserve"> </w:t>
+      </w:r>
+      <w:r>
+        <w:t xml:space="preserve">structure, but it is too small to fit a stable weighted outcome model: with so</w:t>
+      </w:r>
+      <w:r>
+        <w:t xml:space="preserve"> </w:t>
+      </w:r>
+      <w:r>
+        <w:t xml:space="preserve">few deaths the screening-propensity model separates and the resulting weights</w:t>
+      </w:r>
+      <w:r>
+        <w:t xml:space="preserve"> </w:t>
+      </w:r>
+      <w:r>
+        <w:t xml:space="preserve">are erratic. For the weighted analysis we simulate a larger cohort with</w:t>
       </w:r>
       <w:r>
         <w:t xml:space="preserve"> </w:t>
@@ -4728,19 +4746,1742 @@
         <w:rPr>
           <w:rStyle w:val="VerbatimChar"/>
         </w:rPr>
-        <w:t xml:space="preserve">{ettbc}</w:t>
-      </w:r>
-      <w:r>
-        <w:t xml:space="preserve"> </w:t>
-      </w:r>
-      <w:r>
-        <w:t xml:space="preserve">package provides two core functions for the clone-censor step</w:t>
-      </w:r>
-      <w:r>
-        <w:t xml:space="preserve"> </w:t>
-      </w:r>
-      <w:r>
-        <w:t xml:space="preserve">of target trial emulation:</w:t>
+        <w:t xml:space="preserve">simulate_screening_cohort()</w:t>
+      </w:r>
+      <w:r>
+        <w:t xml:space="preserve">, which returns the same three linked tables.</w:t>
+      </w:r>
+    </w:p>
+    <w:p>
+      <w:pPr>
+        <w:pStyle w:val="BodyText"/>
+      </w:pPr>
+      <w:r>
+        <w:t xml:space="preserve">The simulation builds in</w:t>
+      </w:r>
+      <w:r>
+        <w:t xml:space="preserve"> </w:t>
+      </w:r>
+      <w:r>
+        <w:rPr>
+          <w:b/>
+          <w:bCs/>
+        </w:rPr>
+        <w:t xml:space="preserve">no</w:t>
+      </w:r>
+      <w:r>
+        <w:t xml:space="preserve"> </w:t>
+      </w:r>
+      <w:r>
+        <w:t xml:space="preserve">screening effect on mortality, so the honest</w:t>
+      </w:r>
+      <w:r>
+        <w:t xml:space="preserve"> </w:t>
+      </w:r>
+      <w:r>
+        <w:t xml:space="preserve">expectation is a null result: the two arms should look alike, and the weighted</w:t>
+      </w:r>
+      <w:r>
+        <w:t xml:space="preserve"> </w:t>
+      </w:r>
+      <w:r>
+        <w:t xml:space="preserve">contrast should sit near no difference. What the rest of the article</w:t>
+      </w:r>
+      <w:r>
+        <w:t xml:space="preserve"> </w:t>
+      </w:r>
+      <w:r>
+        <w:t xml:space="preserve">demonstrates is that the machinery runs end to end and recovers that null, not</w:t>
+      </w:r>
+      <w:r>
+        <w:t xml:space="preserve"> </w:t>
+      </w:r>
+      <w:r>
+        <w:t xml:space="preserve">a substantive estimate; a real reproduction needs the Medicare cohort and the</w:t>
+      </w:r>
+      <w:r>
+        <w:t xml:space="preserve"> </w:t>
+      </w:r>
+      <w:r>
+        <w:t xml:space="preserve">paper’s full covariate set.</w:t>
+      </w:r>
+    </w:p>
+    <w:p>
+      <w:pPr>
+        <w:pStyle w:val="SourceCode"/>
+      </w:pPr>
+      <w:r>
+        <w:rPr>
+          <w:rStyle w:val="NormalTok"/>
+        </w:rPr>
+        <w:t xml:space="preserve">sim </w:t>
+      </w:r>
+      <w:r>
+        <w:rPr>
+          <w:rStyle w:val="OtherTok"/>
+        </w:rPr>
+        <w:t xml:space="preserve">&lt;-</w:t>
+      </w:r>
+      <w:r>
+        <w:rPr>
+          <w:rStyle w:val="NormalTok"/>
+        </w:rPr>
+        <w:t xml:space="preserve"> </w:t>
+      </w:r>
+      <w:r>
+        <w:rPr>
+          <w:rStyle w:val="FunctionTok"/>
+        </w:rPr>
+        <w:t xml:space="preserve">simulate_screening_cohort</w:t>
+      </w:r>
+      <w:r>
+        <w:rPr>
+          <w:rStyle w:val="NormalTok"/>
+        </w:rPr>
+        <w:t xml:space="preserve">(</w:t>
+      </w:r>
+      <w:r>
+        <w:rPr>
+          <w:rStyle w:val="AttributeTok"/>
+        </w:rPr>
+        <w:t xml:space="preserve">n =</w:t>
+      </w:r>
+      <w:r>
+        <w:rPr>
+          <w:rStyle w:val="NormalTok"/>
+        </w:rPr>
+        <w:t xml:space="preserve"> </w:t>
+      </w:r>
+      <w:r>
+        <w:rPr>
+          <w:rStyle w:val="DecValTok"/>
+        </w:rPr>
+        <w:t xml:space="preserve">1000</w:t>
+      </w:r>
+      <w:r>
+        <w:rPr>
+          <w:rStyle w:val="NormalTok"/>
+        </w:rPr>
+        <w:t xml:space="preserve">, </w:t>
+      </w:r>
+      <w:r>
+        <w:rPr>
+          <w:rStyle w:val="AttributeTok"/>
+        </w:rPr>
+        <w:t xml:space="preserve">max_month =</w:t>
+      </w:r>
+      <w:r>
+        <w:rPr>
+          <w:rStyle w:val="NormalTok"/>
+        </w:rPr>
+        <w:t xml:space="preserve"> </w:t>
+      </w:r>
+      <w:r>
+        <w:rPr>
+          <w:rStyle w:val="DecValTok"/>
+        </w:rPr>
+        <w:t xml:space="preserve">108</w:t>
+      </w:r>
+      <w:r>
+        <w:rPr>
+          <w:rStyle w:val="NormalTok"/>
+        </w:rPr>
+        <w:t xml:space="preserve">, </w:t>
+      </w:r>
+      <w:r>
+        <w:rPr>
+          <w:rStyle w:val="AttributeTok"/>
+        </w:rPr>
+        <w:t xml:space="preserve">seed =</w:t>
+      </w:r>
+      <w:r>
+        <w:rPr>
+          <w:rStyle w:val="NormalTok"/>
+        </w:rPr>
+        <w:t xml:space="preserve"> </w:t>
+      </w:r>
+      <w:r>
+        <w:rPr>
+          <w:rStyle w:val="DecValTok"/>
+        </w:rPr>
+        <w:t xml:space="preserve">7</w:t>
+      </w:r>
+      <w:r>
+        <w:rPr>
+          <w:rStyle w:val="NormalTok"/>
+        </w:rPr>
+        <w:t xml:space="preserve">)</w:t>
+      </w:r>
+      <w:r>
+        <w:br/>
+      </w:r>
+      <w:r>
+        <w:br/>
+      </w:r>
+      <w:r>
+        <w:rPr>
+          <w:rStyle w:val="NormalTok"/>
+        </w:rPr>
+        <w:t xml:space="preserve">cloned_l </w:t>
+      </w:r>
+      <w:r>
+        <w:rPr>
+          <w:rStyle w:val="OtherTok"/>
+        </w:rPr>
+        <w:t xml:space="preserve">&lt;-</w:t>
+      </w:r>
+      <w:r>
+        <w:rPr>
+          <w:rStyle w:val="NormalTok"/>
+        </w:rPr>
+        <w:t xml:space="preserve"> </w:t>
+      </w:r>
+      <w:r>
+        <w:rPr>
+          <w:rStyle w:val="FunctionTok"/>
+        </w:rPr>
+        <w:t xml:space="preserve">clone_censor</w:t>
+      </w:r>
+      <w:r>
+        <w:rPr>
+          <w:rStyle w:val="NormalTok"/>
+        </w:rPr>
+        <w:t xml:space="preserve">(</w:t>
+      </w:r>
+      <w:r>
+        <w:br/>
+      </w:r>
+      <w:r>
+        <w:rPr>
+          <w:rStyle w:val="NormalTok"/>
+        </w:rPr>
+        <w:t xml:space="preserve">  sim</w:t>
+      </w:r>
+      <w:r>
+        <w:rPr>
+          <w:rStyle w:val="SpecialCharTok"/>
+        </w:rPr>
+        <w:t xml:space="preserve">$</w:t>
+      </w:r>
+      <w:r>
+        <w:rPr>
+          <w:rStyle w:val="NormalTok"/>
+        </w:rPr>
+        <w:t xml:space="preserve">cohort, sim</w:t>
+      </w:r>
+      <w:r>
+        <w:rPr>
+          <w:rStyle w:val="SpecialCharTok"/>
+        </w:rPr>
+        <w:t xml:space="preserve">$</w:t>
+      </w:r>
+      <w:r>
+        <w:rPr>
+          <w:rStyle w:val="NormalTok"/>
+        </w:rPr>
+        <w:t xml:space="preserve">screening_mammograms, sim</w:t>
+      </w:r>
+      <w:r>
+        <w:rPr>
+          <w:rStyle w:val="SpecialCharTok"/>
+        </w:rPr>
+        <w:t xml:space="preserve">$</w:t>
+      </w:r>
+      <w:r>
+        <w:rPr>
+          <w:rStyle w:val="NormalTok"/>
+        </w:rPr>
+        <w:t xml:space="preserve">diagnostic_mammograms</w:t>
+      </w:r>
+      <w:r>
+        <w:br/>
+      </w:r>
+      <w:r>
+        <w:rPr>
+          <w:rStyle w:val="NormalTok"/>
+        </w:rPr>
+        <w:t xml:space="preserve">)</w:t>
+      </w:r>
+      <w:r>
+        <w:br/>
+      </w:r>
+      <w:r>
+        <w:rPr>
+          <w:rStyle w:val="NormalTok"/>
+        </w:rPr>
+        <w:t xml:space="preserve">long_l </w:t>
+      </w:r>
+      <w:r>
+        <w:rPr>
+          <w:rStyle w:val="OtherTok"/>
+        </w:rPr>
+        <w:t xml:space="preserve">&lt;-</w:t>
+      </w:r>
+      <w:r>
+        <w:rPr>
+          <w:rStyle w:val="NormalTok"/>
+        </w:rPr>
+        <w:t xml:space="preserve"> </w:t>
+      </w:r>
+      <w:r>
+        <w:rPr>
+          <w:rStyle w:val="FunctionTok"/>
+        </w:rPr>
+        <w:t xml:space="preserve">expand_to_long</w:t>
+      </w:r>
+      <w:r>
+        <w:rPr>
+          <w:rStyle w:val="NormalTok"/>
+        </w:rPr>
+        <w:t xml:space="preserve">(cloned_l)</w:t>
+      </w:r>
+      <w:r>
+        <w:br/>
+      </w:r>
+      <w:r>
+        <w:rPr>
+          <w:rStyle w:val="NormalTok"/>
+        </w:rPr>
+        <w:t xml:space="preserve">long_l </w:t>
+      </w:r>
+      <w:r>
+        <w:rPr>
+          <w:rStyle w:val="OtherTok"/>
+        </w:rPr>
+        <w:t xml:space="preserve">&lt;-</w:t>
+      </w:r>
+      <w:r>
+        <w:rPr>
+          <w:rStyle w:val="NormalTok"/>
+        </w:rPr>
+        <w:t xml:space="preserve"> </w:t>
+      </w:r>
+      <w:r>
+        <w:rPr>
+          <w:rStyle w:val="FunctionTok"/>
+        </w:rPr>
+        <w:t xml:space="preserve">augment_long_covariates</w:t>
+      </w:r>
+      <w:r>
+        <w:rPr>
+          <w:rStyle w:val="NormalTok"/>
+        </w:rPr>
+        <w:t xml:space="preserve">(</w:t>
+      </w:r>
+      <w:r>
+        <w:br/>
+      </w:r>
+      <w:r>
+        <w:rPr>
+          <w:rStyle w:val="NormalTok"/>
+        </w:rPr>
+        <w:t xml:space="preserve">  long_l, sim</w:t>
+      </w:r>
+      <w:r>
+        <w:rPr>
+          <w:rStyle w:val="SpecialCharTok"/>
+        </w:rPr>
+        <w:t xml:space="preserve">$</w:t>
+      </w:r>
+      <w:r>
+        <w:rPr>
+          <w:rStyle w:val="NormalTok"/>
+        </w:rPr>
+        <w:t xml:space="preserve">screening_mammograms, sim</w:t>
+      </w:r>
+      <w:r>
+        <w:rPr>
+          <w:rStyle w:val="SpecialCharTok"/>
+        </w:rPr>
+        <w:t xml:space="preserve">$</w:t>
+      </w:r>
+      <w:r>
+        <w:rPr>
+          <w:rStyle w:val="NormalTok"/>
+        </w:rPr>
+        <w:t xml:space="preserve">diagnostic_mammograms</w:t>
+      </w:r>
+      <w:r>
+        <w:br/>
+      </w:r>
+      <w:r>
+        <w:rPr>
+          <w:rStyle w:val="NormalTok"/>
+        </w:rPr>
+        <w:t xml:space="preserve">)</w:t>
+      </w:r>
+      <w:r>
+        <w:br/>
+      </w:r>
+      <w:r>
+        <w:br/>
+      </w:r>
+      <w:r>
+        <w:rPr>
+          <w:rStyle w:val="FunctionTok"/>
+        </w:rPr>
+        <w:t xml:space="preserve">nrow</w:t>
+      </w:r>
+      <w:r>
+        <w:rPr>
+          <w:rStyle w:val="NormalTok"/>
+        </w:rPr>
+        <w:t xml:space="preserve">(long_l) </w:t>
+      </w:r>
+      <w:r>
+        <w:rPr>
+          <w:rStyle w:val="CommentTok"/>
+        </w:rPr>
+        <w:t xml:space="preserve"># person-arm-months</w:t>
+      </w:r>
+      <w:r>
+        <w:br/>
+      </w:r>
+      <w:r>
+        <w:rPr>
+          <w:rStyle w:val="CommentTok"/>
+        </w:rPr>
+        <w:t xml:space="preserve">#&gt; [1] 73469</w:t>
+      </w:r>
+    </w:p>
+    <w:bookmarkEnd w:id="33"/>
+    <w:bookmarkStart w:id="34" w:name="step-4-inverse-probability-weights"/>
+    <w:p>
+      <w:pPr>
+        <w:pStyle w:val="Heading2"/>
+      </w:pPr>
+      <w:r>
+        <w:t xml:space="preserve">7 Step 4: Inverse Probability Weights</w:t>
+      </w:r>
+    </w:p>
+    <w:p>
+      <w:pPr>
+        <w:pStyle w:val="FirstParagraph"/>
+      </w:pPr>
+      <w:r>
+        <w:rPr>
+          <w:rStyle w:val="VerbatimChar"/>
+        </w:rPr>
+        <w:t xml:space="preserve">fit_screening_propensity()</w:t>
+      </w:r>
+      <w:r>
+        <w:t xml:space="preserve"> </w:t>
+      </w:r>
+      <w:r>
+        <w:t xml:space="preserve">fits the pooled logistic model for the</w:t>
+      </w:r>
+      <w:r>
+        <w:t xml:space="preserve"> </w:t>
+      </w:r>
+      <w:r>
+        <w:t xml:space="preserve">probability of a screening mammogram at each eligible month (the SAS</w:t>
+      </w:r>
+      <w:r>
+        <w:t xml:space="preserve"> </w:t>
+      </w:r>
+      <w:r>
+        <w:rPr>
+          <w:rStyle w:val="VerbatimChar"/>
+        </w:rPr>
+        <w:t xml:space="preserve">cann17b</w:t>
+      </w:r>
+      <w:r>
+        <w:t xml:space="preserve"> </w:t>
+      </w:r>
+      <w:r>
+        <w:t xml:space="preserve">denominator), and</w:t>
+      </w:r>
+      <w:r>
+        <w:t xml:space="preserve"> </w:t>
+      </w:r>
+      <w:r>
+        <w:rPr>
+          <w:rStyle w:val="VerbatimChar"/>
+        </w:rPr>
+        <w:t xml:space="preserve">compute_ipw_weights()</w:t>
+      </w:r>
+      <w:r>
+        <w:t xml:space="preserve"> </w:t>
+      </w:r>
+      <w:r>
+        <w:t xml:space="preserve">turns those probabilities into</w:t>
+      </w:r>
+      <w:r>
+        <w:t xml:space="preserve"> </w:t>
+      </w:r>
+      <w:r>
+        <w:t xml:space="preserve">stabilized per-arm weights, truncated at the 99th percentile within each arm.</w:t>
+      </w:r>
+    </w:p>
+    <w:p>
+      <w:pPr>
+        <w:pStyle w:val="SourceCode"/>
+      </w:pPr>
+      <w:r>
+        <w:rPr>
+          <w:rStyle w:val="NormalTok"/>
+        </w:rPr>
+        <w:t xml:space="preserve">propensity </w:t>
+      </w:r>
+      <w:r>
+        <w:rPr>
+          <w:rStyle w:val="OtherTok"/>
+        </w:rPr>
+        <w:t xml:space="preserve">&lt;-</w:t>
+      </w:r>
+      <w:r>
+        <w:rPr>
+          <w:rStyle w:val="NormalTok"/>
+        </w:rPr>
+        <w:t xml:space="preserve"> </w:t>
+      </w:r>
+      <w:r>
+        <w:rPr>
+          <w:rStyle w:val="FunctionTok"/>
+        </w:rPr>
+        <w:t xml:space="preserve">fit_screening_propensity</w:t>
+      </w:r>
+      <w:r>
+        <w:rPr>
+          <w:rStyle w:val="NormalTok"/>
+        </w:rPr>
+        <w:t xml:space="preserve">(long_l)</w:t>
+      </w:r>
+      <w:r>
+        <w:br/>
+      </w:r>
+      <w:r>
+        <w:rPr>
+          <w:rStyle w:val="NormalTok"/>
+        </w:rPr>
+        <w:t xml:space="preserve">weighted </w:t>
+      </w:r>
+      <w:r>
+        <w:rPr>
+          <w:rStyle w:val="OtherTok"/>
+        </w:rPr>
+        <w:t xml:space="preserve">&lt;-</w:t>
+      </w:r>
+      <w:r>
+        <w:rPr>
+          <w:rStyle w:val="NormalTok"/>
+        </w:rPr>
+        <w:t xml:space="preserve"> </w:t>
+      </w:r>
+      <w:r>
+        <w:rPr>
+          <w:rStyle w:val="FunctionTok"/>
+        </w:rPr>
+        <w:t xml:space="preserve">compute_ipw_weights</w:t>
+      </w:r>
+      <w:r>
+        <w:rPr>
+          <w:rStyle w:val="NormalTok"/>
+        </w:rPr>
+        <w:t xml:space="preserve">(propensity</w:t>
+      </w:r>
+      <w:r>
+        <w:rPr>
+          <w:rStyle w:val="SpecialCharTok"/>
+        </w:rPr>
+        <w:t xml:space="preserve">$</w:t>
+      </w:r>
+      <w:r>
+        <w:rPr>
+          <w:rStyle w:val="NormalTok"/>
+        </w:rPr>
+        <w:t xml:space="preserve">data, </w:t>
+      </w:r>
+      <w:r>
+        <w:rPr>
+          <w:rStyle w:val="AttributeTok"/>
+        </w:rPr>
+        <w:t xml:space="preserve">pred_prob_col =</w:t>
+      </w:r>
+      <w:r>
+        <w:rPr>
+          <w:rStyle w:val="NormalTok"/>
+        </w:rPr>
+        <w:t xml:space="preserve"> </w:t>
+      </w:r>
+      <w:r>
+        <w:rPr>
+          <w:rStyle w:val="StringTok"/>
+        </w:rPr>
+        <w:t xml:space="preserve">"p_scrmammo"</w:t>
+      </w:r>
+      <w:r>
+        <w:rPr>
+          <w:rStyle w:val="NormalTok"/>
+        </w:rPr>
+        <w:t xml:space="preserve">)</w:t>
+      </w:r>
+      <w:r>
+        <w:br/>
+      </w:r>
+      <w:r>
+        <w:br/>
+      </w:r>
+      <w:r>
+        <w:rPr>
+          <w:rStyle w:val="CommentTok"/>
+        </w:rPr>
+        <w:t xml:space="preserve"># Stabilized, truncated weights are centered near 1 in both arms</w:t>
+      </w:r>
+      <w:r>
+        <w:br/>
+      </w:r>
+      <w:r>
+        <w:rPr>
+          <w:rStyle w:val="FunctionTok"/>
+        </w:rPr>
+        <w:t xml:space="preserve">round</w:t>
+      </w:r>
+      <w:r>
+        <w:rPr>
+          <w:rStyle w:val="NormalTok"/>
+        </w:rPr>
+        <w:t xml:space="preserve">(</w:t>
+      </w:r>
+      <w:r>
+        <w:rPr>
+          <w:rStyle w:val="FunctionTok"/>
+        </w:rPr>
+        <w:t xml:space="preserve">t</w:t>
+      </w:r>
+      <w:r>
+        <w:rPr>
+          <w:rStyle w:val="NormalTok"/>
+        </w:rPr>
+        <w:t xml:space="preserve">(</w:t>
+      </w:r>
+      <w:r>
+        <w:rPr>
+          <w:rStyle w:val="FunctionTok"/>
+        </w:rPr>
+        <w:t xml:space="preserve">sapply</w:t>
+      </w:r>
+      <w:r>
+        <w:rPr>
+          <w:rStyle w:val="NormalTok"/>
+        </w:rPr>
+        <w:t xml:space="preserve">(</w:t>
+      </w:r>
+      <w:r>
+        <w:rPr>
+          <w:rStyle w:val="FunctionTok"/>
+        </w:rPr>
+        <w:t xml:space="preserve">split</w:t>
+      </w:r>
+      <w:r>
+        <w:rPr>
+          <w:rStyle w:val="NormalTok"/>
+        </w:rPr>
+        <w:t xml:space="preserve">(weighted</w:t>
+      </w:r>
+      <w:r>
+        <w:rPr>
+          <w:rStyle w:val="SpecialCharTok"/>
+        </w:rPr>
+        <w:t xml:space="preserve">$</w:t>
+      </w:r>
+      <w:r>
+        <w:rPr>
+          <w:rStyle w:val="NormalTok"/>
+        </w:rPr>
+        <w:t xml:space="preserve">wp99, weighted</w:t>
+      </w:r>
+      <w:r>
+        <w:rPr>
+          <w:rStyle w:val="SpecialCharTok"/>
+        </w:rPr>
+        <w:t xml:space="preserve">$</w:t>
+      </w:r>
+      <w:r>
+        <w:rPr>
+          <w:rStyle w:val="NormalTok"/>
+        </w:rPr>
+        <w:t xml:space="preserve">arm), summary)), </w:t>
+      </w:r>
+      <w:r>
+        <w:rPr>
+          <w:rStyle w:val="DecValTok"/>
+        </w:rPr>
+        <w:t xml:space="preserve">2</w:t>
+      </w:r>
+      <w:r>
+        <w:rPr>
+          <w:rStyle w:val="NormalTok"/>
+        </w:rPr>
+        <w:t xml:space="preserve">)</w:t>
+      </w:r>
+      <w:r>
+        <w:br/>
+      </w:r>
+      <w:r>
+        <w:rPr>
+          <w:rStyle w:val="CommentTok"/>
+        </w:rPr>
+        <w:t xml:space="preserve">#&gt;          Min. 1st Qu. Median Mean 3rd Qu.  Max.</w:t>
+      </w:r>
+      <w:r>
+        <w:br/>
+      </w:r>
+      <w:r>
+        <w:rPr>
+          <w:rStyle w:val="CommentTok"/>
+        </w:rPr>
+        <w:t xml:space="preserve">#&gt; CONTINUE    0       1   1.33 2.10    2.17 15.35</w:t>
+      </w:r>
+      <w:r>
+        <w:br/>
+      </w:r>
+      <w:r>
+        <w:rPr>
+          <w:rStyle w:val="CommentTok"/>
+        </w:rPr>
+        <w:t xml:space="preserve">#&gt; STOPBASE    1       1   1.00 5.07   10.15 37.88</w:t>
+      </w:r>
+    </w:p>
+    <w:bookmarkEnd w:id="34"/>
+    <w:bookmarkStart w:id="35" w:name="step-5-weighted-outcome-model"/>
+    <w:p>
+      <w:pPr>
+        <w:pStyle w:val="Heading2"/>
+      </w:pPr>
+      <w:r>
+        <w:t xml:space="preserve">8 Step 5: Weighted Outcome Model</w:t>
+      </w:r>
+    </w:p>
+    <w:p>
+      <w:pPr>
+        <w:pStyle w:val="FirstParagraph"/>
+      </w:pPr>
+      <w:r>
+        <w:rPr>
+          <w:rStyle w:val="VerbatimChar"/>
+        </w:rPr>
+        <w:t xml:space="preserve">fit_outcome_hr()</w:t>
+      </w:r>
+      <w:r>
+        <w:t xml:space="preserve"> </w:t>
+      </w:r>
+      <w:r>
+        <w:t xml:space="preserve">fits the IP-weighted pooled logistic outcome model, with</w:t>
+      </w:r>
+      <w:r>
+        <w:t xml:space="preserve"> </w:t>
+      </w:r>
+      <w:r>
+        <w:t xml:space="preserve">follow-up time entered through a restricted cubic spline and an arm-by-time</w:t>
+      </w:r>
+      <w:r>
+        <w:t xml:space="preserve"> </w:t>
+      </w:r>
+      <w:r>
+        <w:t xml:space="preserve">interaction. The reported odds ratio approximates the hazard ratio for the</w:t>
+      </w:r>
+      <w:r>
+        <w:t xml:space="preserve"> </w:t>
+      </w:r>
+      <w:r>
+        <w:t xml:space="preserve">STOPBASE arm relative to CONTINUE.</w:t>
+      </w:r>
+    </w:p>
+    <w:p>
+      <w:pPr>
+        <w:pStyle w:val="SourceCode"/>
+      </w:pPr>
+      <w:r>
+        <w:rPr>
+          <w:rStyle w:val="NormalTok"/>
+        </w:rPr>
+        <w:t xml:space="preserve">hr </w:t>
+      </w:r>
+      <w:r>
+        <w:rPr>
+          <w:rStyle w:val="OtherTok"/>
+        </w:rPr>
+        <w:t xml:space="preserve">&lt;-</w:t>
+      </w:r>
+      <w:r>
+        <w:rPr>
+          <w:rStyle w:val="NormalTok"/>
+        </w:rPr>
+        <w:t xml:space="preserve"> </w:t>
+      </w:r>
+      <w:r>
+        <w:rPr>
+          <w:rStyle w:val="FunctionTok"/>
+        </w:rPr>
+        <w:t xml:space="preserve">fit_outcome_hr</w:t>
+      </w:r>
+      <w:r>
+        <w:rPr>
+          <w:rStyle w:val="NormalTok"/>
+        </w:rPr>
+        <w:t xml:space="preserve">(</w:t>
+      </w:r>
+      <w:r>
+        <w:br/>
+      </w:r>
+      <w:r>
+        <w:rPr>
+          <w:rStyle w:val="NormalTok"/>
+        </w:rPr>
+        <w:t xml:space="preserve">  weighted,</w:t>
+      </w:r>
+      <w:r>
+        <w:br/>
+      </w:r>
+      <w:r>
+        <w:rPr>
+          <w:rStyle w:val="NormalTok"/>
+        </w:rPr>
+        <w:t xml:space="preserve">  </w:t>
+      </w:r>
+      <w:r>
+        <w:rPr>
+          <w:rStyle w:val="AttributeTok"/>
+        </w:rPr>
+        <w:t xml:space="preserve">weight_col =</w:t>
+      </w:r>
+      <w:r>
+        <w:rPr>
+          <w:rStyle w:val="NormalTok"/>
+        </w:rPr>
+        <w:t xml:space="preserve"> </w:t>
+      </w:r>
+      <w:r>
+        <w:rPr>
+          <w:rStyle w:val="StringTok"/>
+        </w:rPr>
+        <w:t xml:space="preserve">"wp99"</w:t>
+      </w:r>
+      <w:r>
+        <w:rPr>
+          <w:rStyle w:val="NormalTok"/>
+        </w:rPr>
+        <w:t xml:space="preserve">,</w:t>
+      </w:r>
+      <w:r>
+        <w:br/>
+      </w:r>
+      <w:r>
+        <w:rPr>
+          <w:rStyle w:val="NormalTok"/>
+        </w:rPr>
+        <w:t xml:space="preserve">  </w:t>
+      </w:r>
+      <w:r>
+        <w:rPr>
+          <w:rStyle w:val="AttributeTok"/>
+        </w:rPr>
+        <w:t xml:space="preserve">outcome_col =</w:t>
+      </w:r>
+      <w:r>
+        <w:rPr>
+          <w:rStyle w:val="NormalTok"/>
+        </w:rPr>
+        <w:t xml:space="preserve"> </w:t>
+      </w:r>
+      <w:r>
+        <w:rPr>
+          <w:rStyle w:val="StringTok"/>
+        </w:rPr>
+        <w:t xml:space="preserve">"dead_t1"</w:t>
+      </w:r>
+      <w:r>
+        <w:br/>
+      </w:r>
+      <w:r>
+        <w:rPr>
+          <w:rStyle w:val="NormalTok"/>
+        </w:rPr>
+        <w:t xml:space="preserve">)</w:t>
+      </w:r>
+      <w:r>
+        <w:br/>
+      </w:r>
+      <w:r>
+        <w:rPr>
+          <w:rStyle w:val="CommentTok"/>
+        </w:rPr>
+        <w:t xml:space="preserve">#&gt; Warning in eval(family$initialize): non-integer #successes in a binomial glm!</w:t>
+      </w:r>
+      <w:r>
+        <w:br/>
+      </w:r>
+      <w:r>
+        <w:br/>
+      </w:r>
+      <w:r>
+        <w:rPr>
+          <w:rStyle w:val="FunctionTok"/>
+        </w:rPr>
+        <w:t xml:space="preserve">round</w:t>
+      </w:r>
+      <w:r>
+        <w:rPr>
+          <w:rStyle w:val="NormalTok"/>
+        </w:rPr>
+        <w:t xml:space="preserve">(</w:t>
+      </w:r>
+      <w:r>
+        <w:rPr>
+          <w:rStyle w:val="FunctionTok"/>
+        </w:rPr>
+        <w:t xml:space="preserve">c</w:t>
+      </w:r>
+      <w:r>
+        <w:rPr>
+          <w:rStyle w:val="NormalTok"/>
+        </w:rPr>
+        <w:t xml:space="preserve">(</w:t>
+      </w:r>
+      <w:r>
+        <w:rPr>
+          <w:rStyle w:val="AttributeTok"/>
+        </w:rPr>
+        <w:t xml:space="preserve">OR =</w:t>
+      </w:r>
+      <w:r>
+        <w:rPr>
+          <w:rStyle w:val="NormalTok"/>
+        </w:rPr>
+        <w:t xml:space="preserve"> hr</w:t>
+      </w:r>
+      <w:r>
+        <w:rPr>
+          <w:rStyle w:val="SpecialCharTok"/>
+        </w:rPr>
+        <w:t xml:space="preserve">$</w:t>
+      </w:r>
+      <w:r>
+        <w:rPr>
+          <w:rStyle w:val="NormalTok"/>
+        </w:rPr>
+        <w:t xml:space="preserve">or, hr</w:t>
+      </w:r>
+      <w:r>
+        <w:rPr>
+          <w:rStyle w:val="SpecialCharTok"/>
+        </w:rPr>
+        <w:t xml:space="preserve">$</w:t>
+      </w:r>
+      <w:r>
+        <w:rPr>
+          <w:rStyle w:val="NormalTok"/>
+        </w:rPr>
+        <w:t xml:space="preserve">or_ci), </w:t>
+      </w:r>
+      <w:r>
+        <w:rPr>
+          <w:rStyle w:val="DecValTok"/>
+        </w:rPr>
+        <w:t xml:space="preserve">3</w:t>
+      </w:r>
+      <w:r>
+        <w:rPr>
+          <w:rStyle w:val="NormalTok"/>
+        </w:rPr>
+        <w:t xml:space="preserve">)</w:t>
+      </w:r>
+      <w:r>
+        <w:br/>
+      </w:r>
+      <w:r>
+        <w:rPr>
+          <w:rStyle w:val="CommentTok"/>
+        </w:rPr>
+        <w:t xml:space="preserve">#&gt;     OR  2.5 % 97.5 % </w:t>
+      </w:r>
+      <w:r>
+        <w:br/>
+      </w:r>
+      <w:r>
+        <w:rPr>
+          <w:rStyle w:val="CommentTok"/>
+        </w:rPr>
+        <w:t xml:space="preserve">#&gt;  0.976  0.669  1.422</w:t>
+      </w:r>
+    </w:p>
+    <w:p>
+      <w:pPr>
+        <w:pStyle w:val="FirstParagraph"/>
+      </w:pPr>
+      <w:r>
+        <w:t xml:space="preserve">As expected under a simulation with no built-in effect, the odds ratio sits</w:t>
+      </w:r>
+      <w:r>
+        <w:t xml:space="preserve"> </w:t>
+      </w:r>
+      <w:r>
+        <w:t xml:space="preserve">near 1 and its confidence interval covers the null.</w:t>
+      </w:r>
+    </w:p>
+    <w:bookmarkEnd w:id="35"/>
+    <w:bookmarkStart w:id="40" w:name="step-6-standardized-survival-curves"/>
+    <w:p>
+      <w:pPr>
+        <w:pStyle w:val="Heading2"/>
+      </w:pPr>
+      <w:r>
+        <w:t xml:space="preserve">9 Step 6: Standardized Survival Curves</w:t>
+      </w:r>
+    </w:p>
+    <w:p>
+      <w:pPr>
+        <w:pStyle w:val="FirstParagraph"/>
+      </w:pPr>
+      <w:r>
+        <w:rPr>
+          <w:rStyle w:val="VerbatimChar"/>
+        </w:rPr>
+        <w:t xml:space="preserve">predict_survival_ipw()</w:t>
+      </w:r>
+      <w:r>
+        <w:t xml:space="preserve"> </w:t>
+      </w:r>
+      <w:r>
+        <w:t xml:space="preserve">applies g-computation to the weighted model, averaging</w:t>
+      </w:r>
+      <w:r>
+        <w:t xml:space="preserve"> </w:t>
+      </w:r>
+      <w:r>
+        <w:t xml:space="preserve">the predicted survival over the cohort to produce a marginal survival curve for</w:t>
+      </w:r>
+      <w:r>
+        <w:t xml:space="preserve"> </w:t>
+      </w:r>
+      <w:r>
+        <w:t xml:space="preserve">each arm.</w:t>
+      </w:r>
+    </w:p>
+    <w:p>
+      <w:pPr>
+        <w:pStyle w:val="SourceCode"/>
+      </w:pPr>
+      <w:r>
+        <w:rPr>
+          <w:rStyle w:val="NormalTok"/>
+        </w:rPr>
+        <w:t xml:space="preserve">surv </w:t>
+      </w:r>
+      <w:r>
+        <w:rPr>
+          <w:rStyle w:val="OtherTok"/>
+        </w:rPr>
+        <w:t xml:space="preserve">&lt;-</w:t>
+      </w:r>
+      <w:r>
+        <w:rPr>
+          <w:rStyle w:val="NormalTok"/>
+        </w:rPr>
+        <w:t xml:space="preserve"> </w:t>
+      </w:r>
+      <w:r>
+        <w:rPr>
+          <w:rStyle w:val="FunctionTok"/>
+        </w:rPr>
+        <w:t xml:space="preserve">predict_survival_ipw</w:t>
+      </w:r>
+      <w:r>
+        <w:rPr>
+          <w:rStyle w:val="NormalTok"/>
+        </w:rPr>
+        <w:t xml:space="preserve">(</w:t>
+      </w:r>
+      <w:r>
+        <w:br/>
+      </w:r>
+      <w:r>
+        <w:rPr>
+          <w:rStyle w:val="NormalTok"/>
+        </w:rPr>
+        <w:t xml:space="preserve">  weighted,</w:t>
+      </w:r>
+      <w:r>
+        <w:br/>
+      </w:r>
+      <w:r>
+        <w:rPr>
+          <w:rStyle w:val="NormalTok"/>
+        </w:rPr>
+        <w:t xml:space="preserve">  </w:t>
+      </w:r>
+      <w:r>
+        <w:rPr>
+          <w:rStyle w:val="AttributeTok"/>
+        </w:rPr>
+        <w:t xml:space="preserve">weight_col =</w:t>
+      </w:r>
+      <w:r>
+        <w:rPr>
+          <w:rStyle w:val="NormalTok"/>
+        </w:rPr>
+        <w:t xml:space="preserve"> </w:t>
+      </w:r>
+      <w:r>
+        <w:rPr>
+          <w:rStyle w:val="StringTok"/>
+        </w:rPr>
+        <w:t xml:space="preserve">"wp99"</w:t>
+      </w:r>
+      <w:r>
+        <w:rPr>
+          <w:rStyle w:val="NormalTok"/>
+        </w:rPr>
+        <w:t xml:space="preserve">,</w:t>
+      </w:r>
+      <w:r>
+        <w:br/>
+      </w:r>
+      <w:r>
+        <w:rPr>
+          <w:rStyle w:val="NormalTok"/>
+        </w:rPr>
+        <w:t xml:space="preserve">  </w:t>
+      </w:r>
+      <w:r>
+        <w:rPr>
+          <w:rStyle w:val="AttributeTok"/>
+        </w:rPr>
+        <w:t xml:space="preserve">outcome_col =</w:t>
+      </w:r>
+      <w:r>
+        <w:rPr>
+          <w:rStyle w:val="NormalTok"/>
+        </w:rPr>
+        <w:t xml:space="preserve"> </w:t>
+      </w:r>
+      <w:r>
+        <w:rPr>
+          <w:rStyle w:val="StringTok"/>
+        </w:rPr>
+        <w:t xml:space="preserve">"dead_t1"</w:t>
+      </w:r>
+      <w:r>
+        <w:br/>
+      </w:r>
+      <w:r>
+        <w:rPr>
+          <w:rStyle w:val="NormalTok"/>
+        </w:rPr>
+        <w:t xml:space="preserve">)</w:t>
+      </w:r>
+      <w:r>
+        <w:br/>
+      </w:r>
+      <w:r>
+        <w:rPr>
+          <w:rStyle w:val="CommentTok"/>
+        </w:rPr>
+        <w:t xml:space="preserve">#&gt; Warning in eval(family$initialize): non-integer #successes in a binomial glm!</w:t>
+      </w:r>
+      <w:r>
+        <w:br/>
+      </w:r>
+      <w:r>
+        <w:br/>
+      </w:r>
+      <w:r>
+        <w:rPr>
+          <w:rStyle w:val="FunctionTok"/>
+        </w:rPr>
+        <w:t xml:space="preserve">plot</w:t>
+      </w:r>
+      <w:r>
+        <w:rPr>
+          <w:rStyle w:val="NormalTok"/>
+        </w:rPr>
+        <w:t xml:space="preserve">(</w:t>
+      </w:r>
+      <w:r>
+        <w:rPr>
+          <w:rStyle w:val="ConstantTok"/>
+        </w:rPr>
+        <w:t xml:space="preserve">NA</w:t>
+      </w:r>
+      <w:r>
+        <w:rPr>
+          <w:rStyle w:val="NormalTok"/>
+        </w:rPr>
+        <w:t xml:space="preserve">,</w:t>
+      </w:r>
+      <w:r>
+        <w:br/>
+      </w:r>
+      <w:r>
+        <w:rPr>
+          <w:rStyle w:val="NormalTok"/>
+        </w:rPr>
+        <w:t xml:space="preserve">  </w:t>
+      </w:r>
+      <w:r>
+        <w:rPr>
+          <w:rStyle w:val="AttributeTok"/>
+        </w:rPr>
+        <w:t xml:space="preserve">xlim =</w:t>
+      </w:r>
+      <w:r>
+        <w:rPr>
+          <w:rStyle w:val="NormalTok"/>
+        </w:rPr>
+        <w:t xml:space="preserve"> </w:t>
+      </w:r>
+      <w:r>
+        <w:rPr>
+          <w:rStyle w:val="FunctionTok"/>
+        </w:rPr>
+        <w:t xml:space="preserve">c</w:t>
+      </w:r>
+      <w:r>
+        <w:rPr>
+          <w:rStyle w:val="NormalTok"/>
+        </w:rPr>
+        <w:t xml:space="preserve">(</w:t>
+      </w:r>
+      <w:r>
+        <w:rPr>
+          <w:rStyle w:val="DecValTok"/>
+        </w:rPr>
+        <w:t xml:space="preserve">0</w:t>
+      </w:r>
+      <w:r>
+        <w:rPr>
+          <w:rStyle w:val="NormalTok"/>
+        </w:rPr>
+        <w:t xml:space="preserve">, </w:t>
+      </w:r>
+      <w:r>
+        <w:rPr>
+          <w:rStyle w:val="DecValTok"/>
+        </w:rPr>
+        <w:t xml:space="preserve">72</w:t>
+      </w:r>
+      <w:r>
+        <w:rPr>
+          <w:rStyle w:val="NormalTok"/>
+        </w:rPr>
+        <w:t xml:space="preserve">), </w:t>
+      </w:r>
+      <w:r>
+        <w:rPr>
+          <w:rStyle w:val="AttributeTok"/>
+        </w:rPr>
+        <w:t xml:space="preserve">ylim =</w:t>
+      </w:r>
+      <w:r>
+        <w:rPr>
+          <w:rStyle w:val="NormalTok"/>
+        </w:rPr>
+        <w:t xml:space="preserve"> </w:t>
+      </w:r>
+      <w:r>
+        <w:rPr>
+          <w:rStyle w:val="FunctionTok"/>
+        </w:rPr>
+        <w:t xml:space="preserve">c</w:t>
+      </w:r>
+      <w:r>
+        <w:rPr>
+          <w:rStyle w:val="NormalTok"/>
+        </w:rPr>
+        <w:t xml:space="preserve">(</w:t>
+      </w:r>
+      <w:r>
+        <w:rPr>
+          <w:rStyle w:val="FloatTok"/>
+        </w:rPr>
+        <w:t xml:space="preserve">0.8</w:t>
+      </w:r>
+      <w:r>
+        <w:rPr>
+          <w:rStyle w:val="NormalTok"/>
+        </w:rPr>
+        <w:t xml:space="preserve">, </w:t>
+      </w:r>
+      <w:r>
+        <w:rPr>
+          <w:rStyle w:val="DecValTok"/>
+        </w:rPr>
+        <w:t xml:space="preserve">1</w:t>
+      </w:r>
+      <w:r>
+        <w:rPr>
+          <w:rStyle w:val="NormalTok"/>
+        </w:rPr>
+        <w:t xml:space="preserve">),</w:t>
+      </w:r>
+      <w:r>
+        <w:br/>
+      </w:r>
+      <w:r>
+        <w:rPr>
+          <w:rStyle w:val="NormalTok"/>
+        </w:rPr>
+        <w:t xml:space="preserve">  </w:t>
+      </w:r>
+      <w:r>
+        <w:rPr>
+          <w:rStyle w:val="AttributeTok"/>
+        </w:rPr>
+        <w:t xml:space="preserve">xlab =</w:t>
+      </w:r>
+      <w:r>
+        <w:rPr>
+          <w:rStyle w:val="NormalTok"/>
+        </w:rPr>
+        <w:t xml:space="preserve"> </w:t>
+      </w:r>
+      <w:r>
+        <w:rPr>
+          <w:rStyle w:val="StringTok"/>
+        </w:rPr>
+        <w:t xml:space="preserve">"Months since study entry"</w:t>
+      </w:r>
+      <w:r>
+        <w:rPr>
+          <w:rStyle w:val="NormalTok"/>
+        </w:rPr>
+        <w:t xml:space="preserve">,</w:t>
+      </w:r>
+      <w:r>
+        <w:br/>
+      </w:r>
+      <w:r>
+        <w:rPr>
+          <w:rStyle w:val="NormalTok"/>
+        </w:rPr>
+        <w:t xml:space="preserve">  </w:t>
+      </w:r>
+      <w:r>
+        <w:rPr>
+          <w:rStyle w:val="AttributeTok"/>
+        </w:rPr>
+        <w:t xml:space="preserve">ylab =</w:t>
+      </w:r>
+      <w:r>
+        <w:rPr>
+          <w:rStyle w:val="NormalTok"/>
+        </w:rPr>
+        <w:t xml:space="preserve"> </w:t>
+      </w:r>
+      <w:r>
+        <w:rPr>
+          <w:rStyle w:val="StringTok"/>
+        </w:rPr>
+        <w:t xml:space="preserve">"Survival probability"</w:t>
+      </w:r>
+      <w:r>
+        <w:rPr>
+          <w:rStyle w:val="NormalTok"/>
+        </w:rPr>
+        <w:t xml:space="preserve">,</w:t>
+      </w:r>
+      <w:r>
+        <w:br/>
+      </w:r>
+      <w:r>
+        <w:rPr>
+          <w:rStyle w:val="NormalTok"/>
+        </w:rPr>
+        <w:t xml:space="preserve">  </w:t>
+      </w:r>
+      <w:r>
+        <w:rPr>
+          <w:rStyle w:val="AttributeTok"/>
+        </w:rPr>
+        <w:t xml:space="preserve">main =</w:t>
+      </w:r>
+      <w:r>
+        <w:rPr>
+          <w:rStyle w:val="NormalTok"/>
+        </w:rPr>
+        <w:t xml:space="preserve"> </w:t>
+      </w:r>
+      <w:r>
+        <w:rPr>
+          <w:rStyle w:val="StringTok"/>
+        </w:rPr>
+        <w:t xml:space="preserve">"IP-weighted survival by arm"</w:t>
+      </w:r>
+      <w:r>
+        <w:br/>
+      </w:r>
+      <w:r>
+        <w:rPr>
+          <w:rStyle w:val="NormalTok"/>
+        </w:rPr>
+        <w:t xml:space="preserve">)</w:t>
+      </w:r>
+      <w:r>
+        <w:br/>
+      </w:r>
+      <w:r>
+        <w:rPr>
+          <w:rStyle w:val="FunctionTok"/>
+        </w:rPr>
+        <w:t xml:space="preserve">lines</w:t>
+      </w:r>
+      <w:r>
+        <w:rPr>
+          <w:rStyle w:val="NormalTok"/>
+        </w:rPr>
+        <w:t xml:space="preserve">(surv</w:t>
+      </w:r>
+      <w:r>
+        <w:rPr>
+          <w:rStyle w:val="SpecialCharTok"/>
+        </w:rPr>
+        <w:t xml:space="preserve">$</w:t>
+      </w:r>
+      <w:r>
+        <w:rPr>
+          <w:rStyle w:val="NormalTok"/>
+        </w:rPr>
+        <w:t xml:space="preserve">month, surv</w:t>
+      </w:r>
+      <w:r>
+        <w:rPr>
+          <w:rStyle w:val="SpecialCharTok"/>
+        </w:rPr>
+        <w:t xml:space="preserve">$</w:t>
+      </w:r>
+      <w:r>
+        <w:rPr>
+          <w:rStyle w:val="NormalTok"/>
+        </w:rPr>
+        <w:t xml:space="preserve">s_continue, </w:t>
+      </w:r>
+      <w:r>
+        <w:rPr>
+          <w:rStyle w:val="AttributeTok"/>
+        </w:rPr>
+        <w:t xml:space="preserve">col =</w:t>
+      </w:r>
+      <w:r>
+        <w:rPr>
+          <w:rStyle w:val="NormalTok"/>
+        </w:rPr>
+        <w:t xml:space="preserve"> </w:t>
+      </w:r>
+      <w:r>
+        <w:rPr>
+          <w:rStyle w:val="StringTok"/>
+        </w:rPr>
+        <w:t xml:space="preserve">"#4B8FE0"</w:t>
+      </w:r>
+      <w:r>
+        <w:rPr>
+          <w:rStyle w:val="NormalTok"/>
+        </w:rPr>
+        <w:t xml:space="preserve">, </w:t>
+      </w:r>
+      <w:r>
+        <w:rPr>
+          <w:rStyle w:val="AttributeTok"/>
+        </w:rPr>
+        <w:t xml:space="preserve">lwd =</w:t>
+      </w:r>
+      <w:r>
+        <w:rPr>
+          <w:rStyle w:val="NormalTok"/>
+        </w:rPr>
+        <w:t xml:space="preserve"> </w:t>
+      </w:r>
+      <w:r>
+        <w:rPr>
+          <w:rStyle w:val="DecValTok"/>
+        </w:rPr>
+        <w:t xml:space="preserve">2</w:t>
+      </w:r>
+      <w:r>
+        <w:rPr>
+          <w:rStyle w:val="NormalTok"/>
+        </w:rPr>
+        <w:t xml:space="preserve">)</w:t>
+      </w:r>
+      <w:r>
+        <w:br/>
+      </w:r>
+      <w:r>
+        <w:rPr>
+          <w:rStyle w:val="FunctionTok"/>
+        </w:rPr>
+        <w:t xml:space="preserve">lines</w:t>
+      </w:r>
+      <w:r>
+        <w:rPr>
+          <w:rStyle w:val="NormalTok"/>
+        </w:rPr>
+        <w:t xml:space="preserve">(surv</w:t>
+      </w:r>
+      <w:r>
+        <w:rPr>
+          <w:rStyle w:val="SpecialCharTok"/>
+        </w:rPr>
+        <w:t xml:space="preserve">$</w:t>
+      </w:r>
+      <w:r>
+        <w:rPr>
+          <w:rStyle w:val="NormalTok"/>
+        </w:rPr>
+        <w:t xml:space="preserve">month, surv</w:t>
+      </w:r>
+      <w:r>
+        <w:rPr>
+          <w:rStyle w:val="SpecialCharTok"/>
+        </w:rPr>
+        <w:t xml:space="preserve">$</w:t>
+      </w:r>
+      <w:r>
+        <w:rPr>
+          <w:rStyle w:val="NormalTok"/>
+        </w:rPr>
+        <w:t xml:space="preserve">s_stopbase, </w:t>
+      </w:r>
+      <w:r>
+        <w:rPr>
+          <w:rStyle w:val="AttributeTok"/>
+        </w:rPr>
+        <w:t xml:space="preserve">col =</w:t>
+      </w:r>
+      <w:r>
+        <w:rPr>
+          <w:rStyle w:val="NormalTok"/>
+        </w:rPr>
+        <w:t xml:space="preserve"> </w:t>
+      </w:r>
+      <w:r>
+        <w:rPr>
+          <w:rStyle w:val="StringTok"/>
+        </w:rPr>
+        <w:t xml:space="preserve">"#E05C4B"</w:t>
+      </w:r>
+      <w:r>
+        <w:rPr>
+          <w:rStyle w:val="NormalTok"/>
+        </w:rPr>
+        <w:t xml:space="preserve">, </w:t>
+      </w:r>
+      <w:r>
+        <w:rPr>
+          <w:rStyle w:val="AttributeTok"/>
+        </w:rPr>
+        <w:t xml:space="preserve">lwd =</w:t>
+      </w:r>
+      <w:r>
+        <w:rPr>
+          <w:rStyle w:val="NormalTok"/>
+        </w:rPr>
+        <w:t xml:space="preserve"> </w:t>
+      </w:r>
+      <w:r>
+        <w:rPr>
+          <w:rStyle w:val="DecValTok"/>
+        </w:rPr>
+        <w:t xml:space="preserve">2</w:t>
+      </w:r>
+      <w:r>
+        <w:rPr>
+          <w:rStyle w:val="NormalTok"/>
+        </w:rPr>
+        <w:t xml:space="preserve">)</w:t>
+      </w:r>
+      <w:r>
+        <w:br/>
+      </w:r>
+      <w:r>
+        <w:rPr>
+          <w:rStyle w:val="FunctionTok"/>
+        </w:rPr>
+        <w:t xml:space="preserve">legend</w:t>
+      </w:r>
+      <w:r>
+        <w:rPr>
+          <w:rStyle w:val="NormalTok"/>
+        </w:rPr>
+        <w:t xml:space="preserve">(</w:t>
+      </w:r>
+      <w:r>
+        <w:rPr>
+          <w:rStyle w:val="StringTok"/>
+        </w:rPr>
+        <w:t xml:space="preserve">"bottomleft"</w:t>
+      </w:r>
+      <w:r>
+        <w:rPr>
+          <w:rStyle w:val="NormalTok"/>
+        </w:rPr>
+        <w:t xml:space="preserve">,</w:t>
+      </w:r>
+      <w:r>
+        <w:br/>
+      </w:r>
+      <w:r>
+        <w:rPr>
+          <w:rStyle w:val="NormalTok"/>
+        </w:rPr>
+        <w:t xml:space="preserve">  </w:t>
+      </w:r>
+      <w:r>
+        <w:rPr>
+          <w:rStyle w:val="AttributeTok"/>
+        </w:rPr>
+        <w:t xml:space="preserve">legend =</w:t>
+      </w:r>
+      <w:r>
+        <w:rPr>
+          <w:rStyle w:val="NormalTok"/>
+        </w:rPr>
+        <w:t xml:space="preserve"> </w:t>
+      </w:r>
+      <w:r>
+        <w:rPr>
+          <w:rStyle w:val="FunctionTok"/>
+        </w:rPr>
+        <w:t xml:space="preserve">c</w:t>
+      </w:r>
+      <w:r>
+        <w:rPr>
+          <w:rStyle w:val="NormalTok"/>
+        </w:rPr>
+        <w:t xml:space="preserve">(</w:t>
+      </w:r>
+      <w:r>
+        <w:rPr>
+          <w:rStyle w:val="StringTok"/>
+        </w:rPr>
+        <w:t xml:space="preserve">"CONTINUE"</w:t>
+      </w:r>
+      <w:r>
+        <w:rPr>
+          <w:rStyle w:val="NormalTok"/>
+        </w:rPr>
+        <w:t xml:space="preserve">, </w:t>
+      </w:r>
+      <w:r>
+        <w:rPr>
+          <w:rStyle w:val="StringTok"/>
+        </w:rPr>
+        <w:t xml:space="preserve">"STOPBASE"</w:t>
+      </w:r>
+      <w:r>
+        <w:rPr>
+          <w:rStyle w:val="NormalTok"/>
+        </w:rPr>
+        <w:t xml:space="preserve">),</w:t>
+      </w:r>
+      <w:r>
+        <w:br/>
+      </w:r>
+      <w:r>
+        <w:rPr>
+          <w:rStyle w:val="NormalTok"/>
+        </w:rPr>
+        <w:t xml:space="preserve">  </w:t>
+      </w:r>
+      <w:r>
+        <w:rPr>
+          <w:rStyle w:val="AttributeTok"/>
+        </w:rPr>
+        <w:t xml:space="preserve">col =</w:t>
+      </w:r>
+      <w:r>
+        <w:rPr>
+          <w:rStyle w:val="NormalTok"/>
+        </w:rPr>
+        <w:t xml:space="preserve"> </w:t>
+      </w:r>
+      <w:r>
+        <w:rPr>
+          <w:rStyle w:val="FunctionTok"/>
+        </w:rPr>
+        <w:t xml:space="preserve">c</w:t>
+      </w:r>
+      <w:r>
+        <w:rPr>
+          <w:rStyle w:val="NormalTok"/>
+        </w:rPr>
+        <w:t xml:space="preserve">(</w:t>
+      </w:r>
+      <w:r>
+        <w:rPr>
+          <w:rStyle w:val="StringTok"/>
+        </w:rPr>
+        <w:t xml:space="preserve">"#4B8FE0"</w:t>
+      </w:r>
+      <w:r>
+        <w:rPr>
+          <w:rStyle w:val="NormalTok"/>
+        </w:rPr>
+        <w:t xml:space="preserve">, </w:t>
+      </w:r>
+      <w:r>
+        <w:rPr>
+          <w:rStyle w:val="StringTok"/>
+        </w:rPr>
+        <w:t xml:space="preserve">"#E05C4B"</w:t>
+      </w:r>
+      <w:r>
+        <w:rPr>
+          <w:rStyle w:val="NormalTok"/>
+        </w:rPr>
+        <w:t xml:space="preserve">), </w:t>
+      </w:r>
+      <w:r>
+        <w:rPr>
+          <w:rStyle w:val="AttributeTok"/>
+        </w:rPr>
+        <w:t xml:space="preserve">lwd =</w:t>
+      </w:r>
+      <w:r>
+        <w:rPr>
+          <w:rStyle w:val="NormalTok"/>
+        </w:rPr>
+        <w:t xml:space="preserve"> </w:t>
+      </w:r>
+      <w:r>
+        <w:rPr>
+          <w:rStyle w:val="DecValTok"/>
+        </w:rPr>
+        <w:t xml:space="preserve">2</w:t>
+      </w:r>
+      <w:r>
+        <w:rPr>
+          <w:rStyle w:val="NormalTok"/>
+        </w:rPr>
+        <w:t xml:space="preserve">, </w:t>
+      </w:r>
+      <w:r>
+        <w:rPr>
+          <w:rStyle w:val="AttributeTok"/>
+        </w:rPr>
+        <w:t xml:space="preserve">bty =</w:t>
+      </w:r>
+      <w:r>
+        <w:rPr>
+          <w:rStyle w:val="NormalTok"/>
+        </w:rPr>
+        <w:t xml:space="preserve"> </w:t>
+      </w:r>
+      <w:r>
+        <w:rPr>
+          <w:rStyle w:val="StringTok"/>
+        </w:rPr>
+        <w:t xml:space="preserve">"n"</w:t>
+      </w:r>
+      <w:r>
+        <w:br/>
+      </w:r>
+      <w:r>
+        <w:rPr>
+          <w:rStyle w:val="NormalTok"/>
+        </w:rPr>
+        <w:t xml:space="preserve">)</w:t>
       </w:r>
     </w:p>
     <w:tbl>
@@ -4756,7 +6497,1568 @@
       <w:tr>
         <w:tc>
           <w:tcPr/>
-          <w:bookmarkStart w:id="33" w:name="tbl-functions"/>
+          <w:bookmarkStart w:id="39" w:name="fig-ipw-survival"/>
+          <w:p>
+            <w:pPr>
+              <w:pStyle w:val="Compact"/>
+              <w:jc w:val="center"/>
+            </w:pPr>
+            <w:r>
+              <w:drawing>
+                <wp:inline>
+                  <wp:extent cx="5334000" cy="3809999"/>
+                  <wp:effectExtent b="0" l="0" r="0" t="0"/>
+                  <wp:docPr descr="" title="" id="37" name="Picture"/>
+                  <a:graphic>
+                    <a:graphicData uri="http://schemas.openxmlformats.org/drawingml/2006/picture">
+                      <pic:pic>
+                        <pic:nvPicPr>
+                          <pic:cNvPr descr="using-ettbc_files/figure-docx/fig-ipw-survival-1.png" id="38" name="Picture"/>
+                          <pic:cNvPicPr>
+                            <a:picLocks noChangeArrowheads="1" noChangeAspect="1"/>
+                          </pic:cNvPicPr>
+                        </pic:nvPicPr>
+                        <pic:blipFill>
+                          <a:blip r:embed="rId36"/>
+                          <a:stretch>
+                            <a:fillRect/>
+                          </a:stretch>
+                        </pic:blipFill>
+                        <pic:spPr bwMode="auto">
+                          <a:xfrm>
+                            <a:off x="0" y="0"/>
+                            <a:ext cx="5334000" cy="3809999"/>
+                          </a:xfrm>
+                          <a:prstGeom prst="rect">
+                            <a:avLst/>
+                          </a:prstGeom>
+                          <a:noFill/>
+                          <a:ln w="9525">
+                            <a:noFill/>
+                            <a:headEnd/>
+                            <a:tailEnd/>
+                          </a:ln>
+                        </pic:spPr>
+                      </pic:pic>
+                    </a:graphicData>
+                  </a:graphic>
+                </wp:inline>
+              </w:drawing>
+            </w:r>
+          </w:p>
+          <w:p>
+            <w:pPr>
+              <w:jc w:val="center"/>
+            </w:pPr>
+            <w:pPr>
+              <w:jc w:val="left"/>
+              <w:spacing w:before="200"/>
+              <w:pStyle w:val="ImageCaption"/>
+            </w:pPr>
+            <w:r>
+              <w:t xml:space="preserve">Figure 4: IP-weighted marginal survival by arm. The arms track each other closely, consistent with the null effect built into the simulation.</w:t>
+            </w:r>
+          </w:p>
+          <w:bookmarkEnd w:id="39"/>
+        </w:tc>
+      </w:tr>
+    </w:tbl>
+    <w:bookmarkEnd w:id="40"/>
+    <w:bookmarkStart w:id="45" w:name="step-7-bootstrap-confidence-intervals"/>
+    <w:p>
+      <w:pPr>
+        <w:pStyle w:val="Heading2"/>
+      </w:pPr>
+      <w:r>
+        <w:t xml:space="preserve">10 Step 7: Bootstrap Confidence Intervals</w:t>
+      </w:r>
+    </w:p>
+    <w:p>
+      <w:pPr>
+        <w:pStyle w:val="FirstParagraph"/>
+      </w:pPr>
+      <w:r>
+        <w:rPr>
+          <w:rStyle w:val="VerbatimChar"/>
+        </w:rPr>
+        <w:t xml:space="preserve">bootstrap_ci()</w:t>
+      </w:r>
+      <w:r>
+        <w:t xml:space="preserve"> </w:t>
+      </w:r>
+      <w:r>
+        <w:t xml:space="preserve">resamples participants, recomputes the weights and survival</w:t>
+      </w:r>
+      <w:r>
+        <w:t xml:space="preserve"> </w:t>
+      </w:r>
+      <w:r>
+        <w:t xml:space="preserve">curves on each resample, and returns percentile confidence intervals for the</w:t>
+      </w:r>
+      <w:r>
+        <w:t xml:space="preserve"> </w:t>
+      </w:r>
+      <w:r>
+        <w:t xml:space="preserve">month-by-month survival difference between arms. The number of resamples is</w:t>
+      </w:r>
+      <w:r>
+        <w:t xml:space="preserve"> </w:t>
+      </w:r>
+      <w:r>
+        <w:t xml:space="preserve">kept small here so the article renders quickly; a real analysis uses several</w:t>
+      </w:r>
+      <w:r>
+        <w:t xml:space="preserve"> </w:t>
+      </w:r>
+      <w:r>
+        <w:t xml:space="preserve">hundred.</w:t>
+      </w:r>
+    </w:p>
+    <w:p>
+      <w:pPr>
+        <w:pStyle w:val="SourceCode"/>
+      </w:pPr>
+      <w:r>
+        <w:rPr>
+          <w:rStyle w:val="NormalTok"/>
+        </w:rPr>
+        <w:t xml:space="preserve">boot </w:t>
+      </w:r>
+      <w:r>
+        <w:rPr>
+          <w:rStyle w:val="OtherTok"/>
+        </w:rPr>
+        <w:t xml:space="preserve">&lt;-</w:t>
+      </w:r>
+      <w:r>
+        <w:rPr>
+          <w:rStyle w:val="NormalTok"/>
+        </w:rPr>
+        <w:t xml:space="preserve"> </w:t>
+      </w:r>
+      <w:r>
+        <w:rPr>
+          <w:rStyle w:val="FunctionTok"/>
+        </w:rPr>
+        <w:t xml:space="preserve">bootstrap_ci</w:t>
+      </w:r>
+      <w:r>
+        <w:rPr>
+          <w:rStyle w:val="NormalTok"/>
+        </w:rPr>
+        <w:t xml:space="preserve">(</w:t>
+      </w:r>
+      <w:r>
+        <w:br/>
+      </w:r>
+      <w:r>
+        <w:rPr>
+          <w:rStyle w:val="NormalTok"/>
+        </w:rPr>
+        <w:t xml:space="preserve">  propensity</w:t>
+      </w:r>
+      <w:r>
+        <w:rPr>
+          <w:rStyle w:val="SpecialCharTok"/>
+        </w:rPr>
+        <w:t xml:space="preserve">$</w:t>
+      </w:r>
+      <w:r>
+        <w:rPr>
+          <w:rStyle w:val="NormalTok"/>
+        </w:rPr>
+        <w:t xml:space="preserve">data,</w:t>
+      </w:r>
+      <w:r>
+        <w:br/>
+      </w:r>
+      <w:r>
+        <w:rPr>
+          <w:rStyle w:val="NormalTok"/>
+        </w:rPr>
+        <w:t xml:space="preserve">  </w:t>
+      </w:r>
+      <w:r>
+        <w:rPr>
+          <w:rStyle w:val="AttributeTok"/>
+        </w:rPr>
+        <w:t xml:space="preserve">pred_prob_col =</w:t>
+      </w:r>
+      <w:r>
+        <w:rPr>
+          <w:rStyle w:val="NormalTok"/>
+        </w:rPr>
+        <w:t xml:space="preserve"> </w:t>
+      </w:r>
+      <w:r>
+        <w:rPr>
+          <w:rStyle w:val="StringTok"/>
+        </w:rPr>
+        <w:t xml:space="preserve">"p_scrmammo"</w:t>
+      </w:r>
+      <w:r>
+        <w:rPr>
+          <w:rStyle w:val="NormalTok"/>
+        </w:rPr>
+        <w:t xml:space="preserve">,</w:t>
+      </w:r>
+      <w:r>
+        <w:br/>
+      </w:r>
+      <w:r>
+        <w:rPr>
+          <w:rStyle w:val="NormalTok"/>
+        </w:rPr>
+        <w:t xml:space="preserve">  </w:t>
+      </w:r>
+      <w:r>
+        <w:rPr>
+          <w:rStyle w:val="AttributeTok"/>
+        </w:rPr>
+        <w:t xml:space="preserve">outcome_col =</w:t>
+      </w:r>
+      <w:r>
+        <w:rPr>
+          <w:rStyle w:val="NormalTok"/>
+        </w:rPr>
+        <w:t xml:space="preserve"> </w:t>
+      </w:r>
+      <w:r>
+        <w:rPr>
+          <w:rStyle w:val="StringTok"/>
+        </w:rPr>
+        <w:t xml:space="preserve">"dead_t1"</w:t>
+      </w:r>
+      <w:r>
+        <w:rPr>
+          <w:rStyle w:val="NormalTok"/>
+        </w:rPr>
+        <w:t xml:space="preserve">,</w:t>
+      </w:r>
+      <w:r>
+        <w:br/>
+      </w:r>
+      <w:r>
+        <w:rPr>
+          <w:rStyle w:val="NormalTok"/>
+        </w:rPr>
+        <w:t xml:space="preserve">  </w:t>
+      </w:r>
+      <w:r>
+        <w:rPr>
+          <w:rStyle w:val="AttributeTok"/>
+        </w:rPr>
+        <w:t xml:space="preserve">max_month =</w:t>
+      </w:r>
+      <w:r>
+        <w:rPr>
+          <w:rStyle w:val="NormalTok"/>
+        </w:rPr>
+        <w:t xml:space="preserve"> </w:t>
+      </w:r>
+      <w:r>
+        <w:rPr>
+          <w:rStyle w:val="DecValTok"/>
+        </w:rPr>
+        <w:t xml:space="preserve">72</w:t>
+      </w:r>
+      <w:r>
+        <w:rPr>
+          <w:rStyle w:val="NormalTok"/>
+        </w:rPr>
+        <w:t xml:space="preserve">,</w:t>
+      </w:r>
+      <w:r>
+        <w:br/>
+      </w:r>
+      <w:r>
+        <w:rPr>
+          <w:rStyle w:val="NormalTok"/>
+        </w:rPr>
+        <w:t xml:space="preserve">  </w:t>
+      </w:r>
+      <w:r>
+        <w:rPr>
+          <w:rStyle w:val="AttributeTok"/>
+        </w:rPr>
+        <w:t xml:space="preserve">n_boot =</w:t>
+      </w:r>
+      <w:r>
+        <w:rPr>
+          <w:rStyle w:val="NormalTok"/>
+        </w:rPr>
+        <w:t xml:space="preserve"> </w:t>
+      </w:r>
+      <w:r>
+        <w:rPr>
+          <w:rStyle w:val="DecValTok"/>
+        </w:rPr>
+        <w:t xml:space="preserve">50</w:t>
+      </w:r>
+      <w:r>
+        <w:rPr>
+          <w:rStyle w:val="NormalTok"/>
+        </w:rPr>
+        <w:t xml:space="preserve">,</w:t>
+      </w:r>
+      <w:r>
+        <w:br/>
+      </w:r>
+      <w:r>
+        <w:rPr>
+          <w:rStyle w:val="NormalTok"/>
+        </w:rPr>
+        <w:t xml:space="preserve">  </w:t>
+      </w:r>
+      <w:r>
+        <w:rPr>
+          <w:rStyle w:val="AttributeTok"/>
+        </w:rPr>
+        <w:t xml:space="preserve">seed =</w:t>
+      </w:r>
+      <w:r>
+        <w:rPr>
+          <w:rStyle w:val="NormalTok"/>
+        </w:rPr>
+        <w:t xml:space="preserve"> </w:t>
+      </w:r>
+      <w:r>
+        <w:rPr>
+          <w:rStyle w:val="DecValTok"/>
+        </w:rPr>
+        <w:t xml:space="preserve">1</w:t>
+      </w:r>
+      <w:r>
+        <w:br/>
+      </w:r>
+      <w:r>
+        <w:rPr>
+          <w:rStyle w:val="NormalTok"/>
+        </w:rPr>
+        <w:t xml:space="preserve">)</w:t>
+      </w:r>
+      <w:r>
+        <w:br/>
+      </w:r>
+      <w:r>
+        <w:rPr>
+          <w:rStyle w:val="CommentTok"/>
+        </w:rPr>
+        <w:t xml:space="preserve">#&gt; Warning in eval(family$initialize): non-integer #successes in a binomial glm!</w:t>
+      </w:r>
+      <w:r>
+        <w:br/>
+      </w:r>
+      <w:r>
+        <w:rPr>
+          <w:rStyle w:val="CommentTok"/>
+        </w:rPr>
+        <w:t xml:space="preserve">#&gt; Warning in eval(family$initialize): non-integer #successes in a binomial glm!</w:t>
+      </w:r>
+      <w:r>
+        <w:br/>
+      </w:r>
+      <w:r>
+        <w:rPr>
+          <w:rStyle w:val="CommentTok"/>
+        </w:rPr>
+        <w:t xml:space="preserve">#&gt; Warning in eval(family$initialize): non-integer #successes in a binomial glm!</w:t>
+      </w:r>
+      <w:r>
+        <w:br/>
+      </w:r>
+      <w:r>
+        <w:rPr>
+          <w:rStyle w:val="CommentTok"/>
+        </w:rPr>
+        <w:t xml:space="preserve">#&gt; Warning in eval(family$initialize): non-integer #successes in a binomial glm!</w:t>
+      </w:r>
+      <w:r>
+        <w:br/>
+      </w:r>
+      <w:r>
+        <w:rPr>
+          <w:rStyle w:val="CommentTok"/>
+        </w:rPr>
+        <w:t xml:space="preserve">#&gt; Warning in eval(family$initialize): non-integer #successes in a binomial glm!</w:t>
+      </w:r>
+      <w:r>
+        <w:br/>
+      </w:r>
+      <w:r>
+        <w:rPr>
+          <w:rStyle w:val="CommentTok"/>
+        </w:rPr>
+        <w:t xml:space="preserve">#&gt; Warning in eval(family$initialize): non-integer #successes in a binomial glm!</w:t>
+      </w:r>
+      <w:r>
+        <w:br/>
+      </w:r>
+      <w:r>
+        <w:rPr>
+          <w:rStyle w:val="CommentTok"/>
+        </w:rPr>
+        <w:t xml:space="preserve">#&gt; Warning in eval(family$initialize): non-integer #successes in a binomial glm!</w:t>
+      </w:r>
+      <w:r>
+        <w:br/>
+      </w:r>
+      <w:r>
+        <w:rPr>
+          <w:rStyle w:val="CommentTok"/>
+        </w:rPr>
+        <w:t xml:space="preserve">#&gt; Warning in eval(family$initialize): non-integer #successes in a binomial glm!</w:t>
+      </w:r>
+      <w:r>
+        <w:br/>
+      </w:r>
+      <w:r>
+        <w:rPr>
+          <w:rStyle w:val="CommentTok"/>
+        </w:rPr>
+        <w:t xml:space="preserve">#&gt; Warning in eval(family$initialize): non-integer #successes in a binomial glm!</w:t>
+      </w:r>
+      <w:r>
+        <w:br/>
+      </w:r>
+      <w:r>
+        <w:rPr>
+          <w:rStyle w:val="CommentTok"/>
+        </w:rPr>
+        <w:t xml:space="preserve">#&gt; Warning in eval(family$initialize): non-integer #successes in a binomial glm!</w:t>
+      </w:r>
+      <w:r>
+        <w:br/>
+      </w:r>
+      <w:r>
+        <w:rPr>
+          <w:rStyle w:val="CommentTok"/>
+        </w:rPr>
+        <w:t xml:space="preserve">#&gt; Warning in eval(family$initialize): non-integer #successes in a binomial glm!</w:t>
+      </w:r>
+      <w:r>
+        <w:br/>
+      </w:r>
+      <w:r>
+        <w:rPr>
+          <w:rStyle w:val="CommentTok"/>
+        </w:rPr>
+        <w:t xml:space="preserve">#&gt; Warning in eval(family$initialize): non-integer #successes in a binomial glm!</w:t>
+      </w:r>
+      <w:r>
+        <w:br/>
+      </w:r>
+      <w:r>
+        <w:rPr>
+          <w:rStyle w:val="CommentTok"/>
+        </w:rPr>
+        <w:t xml:space="preserve">#&gt; Warning in eval(family$initialize): non-integer #successes in a binomial glm!</w:t>
+      </w:r>
+      <w:r>
+        <w:br/>
+      </w:r>
+      <w:r>
+        <w:rPr>
+          <w:rStyle w:val="CommentTok"/>
+        </w:rPr>
+        <w:t xml:space="preserve">#&gt; Warning in eval(family$initialize): non-integer #successes in a binomial glm!</w:t>
+      </w:r>
+      <w:r>
+        <w:br/>
+      </w:r>
+      <w:r>
+        <w:rPr>
+          <w:rStyle w:val="CommentTok"/>
+        </w:rPr>
+        <w:t xml:space="preserve">#&gt; Warning in eval(family$initialize): non-integer #successes in a binomial glm!</w:t>
+      </w:r>
+      <w:r>
+        <w:br/>
+      </w:r>
+      <w:r>
+        <w:rPr>
+          <w:rStyle w:val="CommentTok"/>
+        </w:rPr>
+        <w:t xml:space="preserve">#&gt; Warning in eval(family$initialize): non-integer #successes in a binomial glm!</w:t>
+      </w:r>
+      <w:r>
+        <w:br/>
+      </w:r>
+      <w:r>
+        <w:rPr>
+          <w:rStyle w:val="CommentTok"/>
+        </w:rPr>
+        <w:t xml:space="preserve">#&gt; Warning in eval(family$initialize): non-integer #successes in a binomial glm!</w:t>
+      </w:r>
+      <w:r>
+        <w:br/>
+      </w:r>
+      <w:r>
+        <w:rPr>
+          <w:rStyle w:val="CommentTok"/>
+        </w:rPr>
+        <w:t xml:space="preserve">#&gt; Warning in eval(family$initialize): non-integer #successes in a binomial glm!</w:t>
+      </w:r>
+      <w:r>
+        <w:br/>
+      </w:r>
+      <w:r>
+        <w:rPr>
+          <w:rStyle w:val="CommentTok"/>
+        </w:rPr>
+        <w:t xml:space="preserve">#&gt; Warning in eval(family$initialize): non-integer #successes in a binomial glm!</w:t>
+      </w:r>
+      <w:r>
+        <w:br/>
+      </w:r>
+      <w:r>
+        <w:rPr>
+          <w:rStyle w:val="CommentTok"/>
+        </w:rPr>
+        <w:t xml:space="preserve">#&gt; Warning in eval(family$initialize): non-integer #successes in a binomial glm!</w:t>
+      </w:r>
+      <w:r>
+        <w:br/>
+      </w:r>
+      <w:r>
+        <w:rPr>
+          <w:rStyle w:val="CommentTok"/>
+        </w:rPr>
+        <w:t xml:space="preserve">#&gt; Warning in eval(family$initialize): non-integer #successes in a binomial glm!</w:t>
+      </w:r>
+      <w:r>
+        <w:br/>
+      </w:r>
+      <w:r>
+        <w:rPr>
+          <w:rStyle w:val="CommentTok"/>
+        </w:rPr>
+        <w:t xml:space="preserve">#&gt; Warning in eval(family$initialize): non-integer #successes in a binomial glm!</w:t>
+      </w:r>
+      <w:r>
+        <w:br/>
+      </w:r>
+      <w:r>
+        <w:rPr>
+          <w:rStyle w:val="CommentTok"/>
+        </w:rPr>
+        <w:t xml:space="preserve">#&gt; Warning in eval(family$initialize): non-integer #successes in a binomial glm!</w:t>
+      </w:r>
+      <w:r>
+        <w:br/>
+      </w:r>
+      <w:r>
+        <w:rPr>
+          <w:rStyle w:val="CommentTok"/>
+        </w:rPr>
+        <w:t xml:space="preserve">#&gt; Warning in eval(family$initialize): non-integer #successes in a binomial glm!</w:t>
+      </w:r>
+      <w:r>
+        <w:br/>
+      </w:r>
+      <w:r>
+        <w:rPr>
+          <w:rStyle w:val="CommentTok"/>
+        </w:rPr>
+        <w:t xml:space="preserve">#&gt; Warning in eval(family$initialize): non-integer #successes in a binomial glm!</w:t>
+      </w:r>
+      <w:r>
+        <w:br/>
+      </w:r>
+      <w:r>
+        <w:rPr>
+          <w:rStyle w:val="CommentTok"/>
+        </w:rPr>
+        <w:t xml:space="preserve">#&gt; Warning in eval(family$initialize): non-integer #successes in a binomial glm!</w:t>
+      </w:r>
+      <w:r>
+        <w:br/>
+      </w:r>
+      <w:r>
+        <w:rPr>
+          <w:rStyle w:val="CommentTok"/>
+        </w:rPr>
+        <w:t xml:space="preserve">#&gt; Warning in eval(family$initialize): non-integer #successes in a binomial glm!</w:t>
+      </w:r>
+      <w:r>
+        <w:br/>
+      </w:r>
+      <w:r>
+        <w:rPr>
+          <w:rStyle w:val="CommentTok"/>
+        </w:rPr>
+        <w:t xml:space="preserve">#&gt; Warning in eval(family$initialize): non-integer #successes in a binomial glm!</w:t>
+      </w:r>
+      <w:r>
+        <w:br/>
+      </w:r>
+      <w:r>
+        <w:rPr>
+          <w:rStyle w:val="CommentTok"/>
+        </w:rPr>
+        <w:t xml:space="preserve">#&gt; Warning in eval(family$initialize): non-integer #successes in a binomial glm!</w:t>
+      </w:r>
+      <w:r>
+        <w:br/>
+      </w:r>
+      <w:r>
+        <w:rPr>
+          <w:rStyle w:val="CommentTok"/>
+        </w:rPr>
+        <w:t xml:space="preserve">#&gt; Warning in eval(family$initialize): non-integer #successes in a binomial glm!</w:t>
+      </w:r>
+      <w:r>
+        <w:br/>
+      </w:r>
+      <w:r>
+        <w:rPr>
+          <w:rStyle w:val="CommentTok"/>
+        </w:rPr>
+        <w:t xml:space="preserve">#&gt; Warning in eval(family$initialize): non-integer #successes in a binomial glm!</w:t>
+      </w:r>
+      <w:r>
+        <w:br/>
+      </w:r>
+      <w:r>
+        <w:rPr>
+          <w:rStyle w:val="CommentTok"/>
+        </w:rPr>
+        <w:t xml:space="preserve">#&gt; Warning in eval(family$initialize): non-integer #successes in a binomial glm!</w:t>
+      </w:r>
+      <w:r>
+        <w:br/>
+      </w:r>
+      <w:r>
+        <w:rPr>
+          <w:rStyle w:val="CommentTok"/>
+        </w:rPr>
+        <w:t xml:space="preserve">#&gt; Warning in eval(family$initialize): non-integer #successes in a binomial glm!</w:t>
+      </w:r>
+      <w:r>
+        <w:br/>
+      </w:r>
+      <w:r>
+        <w:rPr>
+          <w:rStyle w:val="CommentTok"/>
+        </w:rPr>
+        <w:t xml:space="preserve">#&gt; Warning in eval(family$initialize): non-integer #successes in a binomial glm!</w:t>
+      </w:r>
+      <w:r>
+        <w:br/>
+      </w:r>
+      <w:r>
+        <w:rPr>
+          <w:rStyle w:val="CommentTok"/>
+        </w:rPr>
+        <w:t xml:space="preserve">#&gt; Warning in eval(family$initialize): non-integer #successes in a binomial glm!</w:t>
+      </w:r>
+      <w:r>
+        <w:br/>
+      </w:r>
+      <w:r>
+        <w:rPr>
+          <w:rStyle w:val="CommentTok"/>
+        </w:rPr>
+        <w:t xml:space="preserve">#&gt; Warning in eval(family$initialize): non-integer #successes in a binomial glm!</w:t>
+      </w:r>
+      <w:r>
+        <w:br/>
+      </w:r>
+      <w:r>
+        <w:rPr>
+          <w:rStyle w:val="CommentTok"/>
+        </w:rPr>
+        <w:t xml:space="preserve">#&gt; Warning in eval(family$initialize): non-integer #successes in a binomial glm!</w:t>
+      </w:r>
+      <w:r>
+        <w:br/>
+      </w:r>
+      <w:r>
+        <w:rPr>
+          <w:rStyle w:val="CommentTok"/>
+        </w:rPr>
+        <w:t xml:space="preserve">#&gt; Warning in eval(family$initialize): non-integer #successes in a binomial glm!</w:t>
+      </w:r>
+      <w:r>
+        <w:br/>
+      </w:r>
+      <w:r>
+        <w:rPr>
+          <w:rStyle w:val="CommentTok"/>
+        </w:rPr>
+        <w:t xml:space="preserve">#&gt; Warning in eval(family$initialize): non-integer #successes in a binomial glm!</w:t>
+      </w:r>
+      <w:r>
+        <w:br/>
+      </w:r>
+      <w:r>
+        <w:rPr>
+          <w:rStyle w:val="CommentTok"/>
+        </w:rPr>
+        <w:t xml:space="preserve">#&gt; Warning in eval(family$initialize): non-integer #successes in a binomial glm!</w:t>
+      </w:r>
+      <w:r>
+        <w:br/>
+      </w:r>
+      <w:r>
+        <w:rPr>
+          <w:rStyle w:val="CommentTok"/>
+        </w:rPr>
+        <w:t xml:space="preserve">#&gt; Warning in eval(family$initialize): non-integer #successes in a binomial glm!</w:t>
+      </w:r>
+      <w:r>
+        <w:br/>
+      </w:r>
+      <w:r>
+        <w:rPr>
+          <w:rStyle w:val="CommentTok"/>
+        </w:rPr>
+        <w:t xml:space="preserve">#&gt; Warning in eval(family$initialize): non-integer #successes in a binomial glm!</w:t>
+      </w:r>
+      <w:r>
+        <w:br/>
+      </w:r>
+      <w:r>
+        <w:rPr>
+          <w:rStyle w:val="CommentTok"/>
+        </w:rPr>
+        <w:t xml:space="preserve">#&gt; Warning in eval(family$initialize): non-integer #successes in a binomial glm!</w:t>
+      </w:r>
+      <w:r>
+        <w:br/>
+      </w:r>
+      <w:r>
+        <w:rPr>
+          <w:rStyle w:val="CommentTok"/>
+        </w:rPr>
+        <w:t xml:space="preserve">#&gt; Warning in eval(family$initialize): non-integer #successes in a binomial glm!</w:t>
+      </w:r>
+      <w:r>
+        <w:br/>
+      </w:r>
+      <w:r>
+        <w:rPr>
+          <w:rStyle w:val="CommentTok"/>
+        </w:rPr>
+        <w:t xml:space="preserve">#&gt; Warning in eval(family$initialize): non-integer #successes in a binomial glm!</w:t>
+      </w:r>
+      <w:r>
+        <w:br/>
+      </w:r>
+      <w:r>
+        <w:rPr>
+          <w:rStyle w:val="CommentTok"/>
+        </w:rPr>
+        <w:t xml:space="preserve">#&gt; Warning in eval(family$initialize): non-integer #successes in a binomial glm!</w:t>
+      </w:r>
+      <w:r>
+        <w:br/>
+      </w:r>
+      <w:r>
+        <w:rPr>
+          <w:rStyle w:val="CommentTok"/>
+        </w:rPr>
+        <w:t xml:space="preserve">#&gt; Warning in eval(family$initialize): non-integer #successes in a binomial glm!</w:t>
+      </w:r>
+      <w:r>
+        <w:br/>
+      </w:r>
+      <w:r>
+        <w:rPr>
+          <w:rStyle w:val="CommentTok"/>
+        </w:rPr>
+        <w:t xml:space="preserve">#&gt; Warning in eval(family$initialize): non-integer #successes in a binomial glm!</w:t>
+      </w:r>
+      <w:r>
+        <w:br/>
+      </w:r>
+      <w:r>
+        <w:rPr>
+          <w:rStyle w:val="CommentTok"/>
+        </w:rPr>
+        <w:t xml:space="preserve">#&gt; Warning in eval(family$initialize): non-integer #successes in a binomial glm!</w:t>
+      </w:r>
+      <w:r>
+        <w:br/>
+      </w:r>
+      <w:r>
+        <w:rPr>
+          <w:rStyle w:val="CommentTok"/>
+        </w:rPr>
+        <w:t xml:space="preserve">#&gt; Warning in eval(family$initialize): non-integer #successes in a binomial glm!</w:t>
+      </w:r>
+      <w:r>
+        <w:br/>
+      </w:r>
+      <w:r>
+        <w:rPr>
+          <w:rStyle w:val="CommentTok"/>
+        </w:rPr>
+        <w:t xml:space="preserve">#&gt; Warning in eval(family$initialize): non-integer #successes in a binomial glm!</w:t>
+      </w:r>
+      <w:r>
+        <w:br/>
+      </w:r>
+      <w:r>
+        <w:br/>
+      </w:r>
+      <w:r>
+        <w:rPr>
+          <w:rStyle w:val="FunctionTok"/>
+        </w:rPr>
+        <w:t xml:space="preserve">plot</w:t>
+      </w:r>
+      <w:r>
+        <w:rPr>
+          <w:rStyle w:val="NormalTok"/>
+        </w:rPr>
+        <w:t xml:space="preserve">(</w:t>
+      </w:r>
+      <w:r>
+        <w:rPr>
+          <w:rStyle w:val="ConstantTok"/>
+        </w:rPr>
+        <w:t xml:space="preserve">NA</w:t>
+      </w:r>
+      <w:r>
+        <w:rPr>
+          <w:rStyle w:val="NormalTok"/>
+        </w:rPr>
+        <w:t xml:space="preserve">,</w:t>
+      </w:r>
+      <w:r>
+        <w:br/>
+      </w:r>
+      <w:r>
+        <w:rPr>
+          <w:rStyle w:val="NormalTok"/>
+        </w:rPr>
+        <w:t xml:space="preserve">  </w:t>
+      </w:r>
+      <w:r>
+        <w:rPr>
+          <w:rStyle w:val="AttributeTok"/>
+        </w:rPr>
+        <w:t xml:space="preserve">xlim =</w:t>
+      </w:r>
+      <w:r>
+        <w:rPr>
+          <w:rStyle w:val="NormalTok"/>
+        </w:rPr>
+        <w:t xml:space="preserve"> </w:t>
+      </w:r>
+      <w:r>
+        <w:rPr>
+          <w:rStyle w:val="FunctionTok"/>
+        </w:rPr>
+        <w:t xml:space="preserve">c</w:t>
+      </w:r>
+      <w:r>
+        <w:rPr>
+          <w:rStyle w:val="NormalTok"/>
+        </w:rPr>
+        <w:t xml:space="preserve">(</w:t>
+      </w:r>
+      <w:r>
+        <w:rPr>
+          <w:rStyle w:val="DecValTok"/>
+        </w:rPr>
+        <w:t xml:space="preserve">0</w:t>
+      </w:r>
+      <w:r>
+        <w:rPr>
+          <w:rStyle w:val="NormalTok"/>
+        </w:rPr>
+        <w:t xml:space="preserve">, </w:t>
+      </w:r>
+      <w:r>
+        <w:rPr>
+          <w:rStyle w:val="DecValTok"/>
+        </w:rPr>
+        <w:t xml:space="preserve">72</w:t>
+      </w:r>
+      <w:r>
+        <w:rPr>
+          <w:rStyle w:val="NormalTok"/>
+        </w:rPr>
+        <w:t xml:space="preserve">), </w:t>
+      </w:r>
+      <w:r>
+        <w:rPr>
+          <w:rStyle w:val="AttributeTok"/>
+        </w:rPr>
+        <w:t xml:space="preserve">ylim =</w:t>
+      </w:r>
+      <w:r>
+        <w:rPr>
+          <w:rStyle w:val="NormalTok"/>
+        </w:rPr>
+        <w:t xml:space="preserve"> </w:t>
+      </w:r>
+      <w:r>
+        <w:rPr>
+          <w:rStyle w:val="FunctionTok"/>
+        </w:rPr>
+        <w:t xml:space="preserve">range</w:t>
+      </w:r>
+      <w:r>
+        <w:rPr>
+          <w:rStyle w:val="NormalTok"/>
+        </w:rPr>
+        <w:t xml:space="preserve">(</w:t>
+      </w:r>
+      <w:r>
+        <w:rPr>
+          <w:rStyle w:val="FunctionTok"/>
+        </w:rPr>
+        <w:t xml:space="preserve">c</w:t>
+      </w:r>
+      <w:r>
+        <w:rPr>
+          <w:rStyle w:val="NormalTok"/>
+        </w:rPr>
+        <w:t xml:space="preserve">(boot</w:t>
+      </w:r>
+      <w:r>
+        <w:rPr>
+          <w:rStyle w:val="SpecialCharTok"/>
+        </w:rPr>
+        <w:t xml:space="preserve">$</w:t>
+      </w:r>
+      <w:r>
+        <w:rPr>
+          <w:rStyle w:val="NormalTok"/>
+        </w:rPr>
+        <w:t xml:space="preserve">diff_lo, boot</w:t>
+      </w:r>
+      <w:r>
+        <w:rPr>
+          <w:rStyle w:val="SpecialCharTok"/>
+        </w:rPr>
+        <w:t xml:space="preserve">$</w:t>
+      </w:r>
+      <w:r>
+        <w:rPr>
+          <w:rStyle w:val="NormalTok"/>
+        </w:rPr>
+        <w:t xml:space="preserve">diff_hi), </w:t>
+      </w:r>
+      <w:r>
+        <w:rPr>
+          <w:rStyle w:val="AttributeTok"/>
+        </w:rPr>
+        <w:t xml:space="preserve">na.rm =</w:t>
+      </w:r>
+      <w:r>
+        <w:rPr>
+          <w:rStyle w:val="NormalTok"/>
+        </w:rPr>
+        <w:t xml:space="preserve"> </w:t>
+      </w:r>
+      <w:r>
+        <w:rPr>
+          <w:rStyle w:val="ConstantTok"/>
+        </w:rPr>
+        <w:t xml:space="preserve">TRUE</w:t>
+      </w:r>
+      <w:r>
+        <w:rPr>
+          <w:rStyle w:val="NormalTok"/>
+        </w:rPr>
+        <w:t xml:space="preserve">),</w:t>
+      </w:r>
+      <w:r>
+        <w:br/>
+      </w:r>
+      <w:r>
+        <w:rPr>
+          <w:rStyle w:val="NormalTok"/>
+        </w:rPr>
+        <w:t xml:space="preserve">  </w:t>
+      </w:r>
+      <w:r>
+        <w:rPr>
+          <w:rStyle w:val="AttributeTok"/>
+        </w:rPr>
+        <w:t xml:space="preserve">xlab =</w:t>
+      </w:r>
+      <w:r>
+        <w:rPr>
+          <w:rStyle w:val="NormalTok"/>
+        </w:rPr>
+        <w:t xml:space="preserve"> </w:t>
+      </w:r>
+      <w:r>
+        <w:rPr>
+          <w:rStyle w:val="StringTok"/>
+        </w:rPr>
+        <w:t xml:space="preserve">"Months since study entry"</w:t>
+      </w:r>
+      <w:r>
+        <w:rPr>
+          <w:rStyle w:val="NormalTok"/>
+        </w:rPr>
+        <w:t xml:space="preserve">,</w:t>
+      </w:r>
+      <w:r>
+        <w:br/>
+      </w:r>
+      <w:r>
+        <w:rPr>
+          <w:rStyle w:val="NormalTok"/>
+        </w:rPr>
+        <w:t xml:space="preserve">  </w:t>
+      </w:r>
+      <w:r>
+        <w:rPr>
+          <w:rStyle w:val="AttributeTok"/>
+        </w:rPr>
+        <w:t xml:space="preserve">ylab =</w:t>
+      </w:r>
+      <w:r>
+        <w:rPr>
+          <w:rStyle w:val="NormalTok"/>
+        </w:rPr>
+        <w:t xml:space="preserve"> </w:t>
+      </w:r>
+      <w:r>
+        <w:rPr>
+          <w:rStyle w:val="StringTok"/>
+        </w:rPr>
+        <w:t xml:space="preserve">"Survival difference (CONTINUE - STOPBASE)"</w:t>
+      </w:r>
+      <w:r>
+        <w:rPr>
+          <w:rStyle w:val="NormalTok"/>
+        </w:rPr>
+        <w:t xml:space="preserve">,</w:t>
+      </w:r>
+      <w:r>
+        <w:br/>
+      </w:r>
+      <w:r>
+        <w:rPr>
+          <w:rStyle w:val="NormalTok"/>
+        </w:rPr>
+        <w:t xml:space="preserve">  </w:t>
+      </w:r>
+      <w:r>
+        <w:rPr>
+          <w:rStyle w:val="AttributeTok"/>
+        </w:rPr>
+        <w:t xml:space="preserve">main =</w:t>
+      </w:r>
+      <w:r>
+        <w:rPr>
+          <w:rStyle w:val="NormalTok"/>
+        </w:rPr>
+        <w:t xml:space="preserve"> </w:t>
+      </w:r>
+      <w:r>
+        <w:rPr>
+          <w:rStyle w:val="StringTok"/>
+        </w:rPr>
+        <w:t xml:space="preserve">"Bootstrap survival difference with 95% CI"</w:t>
+      </w:r>
+      <w:r>
+        <w:br/>
+      </w:r>
+      <w:r>
+        <w:rPr>
+          <w:rStyle w:val="NormalTok"/>
+        </w:rPr>
+        <w:t xml:space="preserve">)</w:t>
+      </w:r>
+      <w:r>
+        <w:br/>
+      </w:r>
+      <w:r>
+        <w:rPr>
+          <w:rStyle w:val="FunctionTok"/>
+        </w:rPr>
+        <w:t xml:space="preserve">abline</w:t>
+      </w:r>
+      <w:r>
+        <w:rPr>
+          <w:rStyle w:val="NormalTok"/>
+        </w:rPr>
+        <w:t xml:space="preserve">(</w:t>
+      </w:r>
+      <w:r>
+        <w:rPr>
+          <w:rStyle w:val="AttributeTok"/>
+        </w:rPr>
+        <w:t xml:space="preserve">h =</w:t>
+      </w:r>
+      <w:r>
+        <w:rPr>
+          <w:rStyle w:val="NormalTok"/>
+        </w:rPr>
+        <w:t xml:space="preserve"> </w:t>
+      </w:r>
+      <w:r>
+        <w:rPr>
+          <w:rStyle w:val="DecValTok"/>
+        </w:rPr>
+        <w:t xml:space="preserve">0</w:t>
+      </w:r>
+      <w:r>
+        <w:rPr>
+          <w:rStyle w:val="NormalTok"/>
+        </w:rPr>
+        <w:t xml:space="preserve">, </w:t>
+      </w:r>
+      <w:r>
+        <w:rPr>
+          <w:rStyle w:val="AttributeTok"/>
+        </w:rPr>
+        <w:t xml:space="preserve">col =</w:t>
+      </w:r>
+      <w:r>
+        <w:rPr>
+          <w:rStyle w:val="NormalTok"/>
+        </w:rPr>
+        <w:t xml:space="preserve"> </w:t>
+      </w:r>
+      <w:r>
+        <w:rPr>
+          <w:rStyle w:val="StringTok"/>
+        </w:rPr>
+        <w:t xml:space="preserve">"grey60"</w:t>
+      </w:r>
+      <w:r>
+        <w:rPr>
+          <w:rStyle w:val="NormalTok"/>
+        </w:rPr>
+        <w:t xml:space="preserve">, </w:t>
+      </w:r>
+      <w:r>
+        <w:rPr>
+          <w:rStyle w:val="AttributeTok"/>
+        </w:rPr>
+        <w:t xml:space="preserve">lty =</w:t>
+      </w:r>
+      <w:r>
+        <w:rPr>
+          <w:rStyle w:val="NormalTok"/>
+        </w:rPr>
+        <w:t xml:space="preserve"> </w:t>
+      </w:r>
+      <w:r>
+        <w:rPr>
+          <w:rStyle w:val="DecValTok"/>
+        </w:rPr>
+        <w:t xml:space="preserve">2</w:t>
+      </w:r>
+      <w:r>
+        <w:rPr>
+          <w:rStyle w:val="NormalTok"/>
+        </w:rPr>
+        <w:t xml:space="preserve">)</w:t>
+      </w:r>
+      <w:r>
+        <w:br/>
+      </w:r>
+      <w:r>
+        <w:rPr>
+          <w:rStyle w:val="FunctionTok"/>
+        </w:rPr>
+        <w:t xml:space="preserve">polygon</w:t>
+      </w:r>
+      <w:r>
+        <w:rPr>
+          <w:rStyle w:val="NormalTok"/>
+        </w:rPr>
+        <w:t xml:space="preserve">(</w:t>
+      </w:r>
+      <w:r>
+        <w:br/>
+      </w:r>
+      <w:r>
+        <w:rPr>
+          <w:rStyle w:val="NormalTok"/>
+        </w:rPr>
+        <w:t xml:space="preserve">  </w:t>
+      </w:r>
+      <w:r>
+        <w:rPr>
+          <w:rStyle w:val="FunctionTok"/>
+        </w:rPr>
+        <w:t xml:space="preserve">c</w:t>
+      </w:r>
+      <w:r>
+        <w:rPr>
+          <w:rStyle w:val="NormalTok"/>
+        </w:rPr>
+        <w:t xml:space="preserve">(boot</w:t>
+      </w:r>
+      <w:r>
+        <w:rPr>
+          <w:rStyle w:val="SpecialCharTok"/>
+        </w:rPr>
+        <w:t xml:space="preserve">$</w:t>
+      </w:r>
+      <w:r>
+        <w:rPr>
+          <w:rStyle w:val="NormalTok"/>
+        </w:rPr>
+        <w:t xml:space="preserve">month, </w:t>
+      </w:r>
+      <w:r>
+        <w:rPr>
+          <w:rStyle w:val="FunctionTok"/>
+        </w:rPr>
+        <w:t xml:space="preserve">rev</w:t>
+      </w:r>
+      <w:r>
+        <w:rPr>
+          <w:rStyle w:val="NormalTok"/>
+        </w:rPr>
+        <w:t xml:space="preserve">(boot</w:t>
+      </w:r>
+      <w:r>
+        <w:rPr>
+          <w:rStyle w:val="SpecialCharTok"/>
+        </w:rPr>
+        <w:t xml:space="preserve">$</w:t>
+      </w:r>
+      <w:r>
+        <w:rPr>
+          <w:rStyle w:val="NormalTok"/>
+        </w:rPr>
+        <w:t xml:space="preserve">month)),</w:t>
+      </w:r>
+      <w:r>
+        <w:br/>
+      </w:r>
+      <w:r>
+        <w:rPr>
+          <w:rStyle w:val="NormalTok"/>
+        </w:rPr>
+        <w:t xml:space="preserve">  </w:t>
+      </w:r>
+      <w:r>
+        <w:rPr>
+          <w:rStyle w:val="FunctionTok"/>
+        </w:rPr>
+        <w:t xml:space="preserve">c</w:t>
+      </w:r>
+      <w:r>
+        <w:rPr>
+          <w:rStyle w:val="NormalTok"/>
+        </w:rPr>
+        <w:t xml:space="preserve">(boot</w:t>
+      </w:r>
+      <w:r>
+        <w:rPr>
+          <w:rStyle w:val="SpecialCharTok"/>
+        </w:rPr>
+        <w:t xml:space="preserve">$</w:t>
+      </w:r>
+      <w:r>
+        <w:rPr>
+          <w:rStyle w:val="NormalTok"/>
+        </w:rPr>
+        <w:t xml:space="preserve">diff_lo, </w:t>
+      </w:r>
+      <w:r>
+        <w:rPr>
+          <w:rStyle w:val="FunctionTok"/>
+        </w:rPr>
+        <w:t xml:space="preserve">rev</w:t>
+      </w:r>
+      <w:r>
+        <w:rPr>
+          <w:rStyle w:val="NormalTok"/>
+        </w:rPr>
+        <w:t xml:space="preserve">(boot</w:t>
+      </w:r>
+      <w:r>
+        <w:rPr>
+          <w:rStyle w:val="SpecialCharTok"/>
+        </w:rPr>
+        <w:t xml:space="preserve">$</w:t>
+      </w:r>
+      <w:r>
+        <w:rPr>
+          <w:rStyle w:val="NormalTok"/>
+        </w:rPr>
+        <w:t xml:space="preserve">diff_hi)),</w:t>
+      </w:r>
+      <w:r>
+        <w:br/>
+      </w:r>
+      <w:r>
+        <w:rPr>
+          <w:rStyle w:val="NormalTok"/>
+        </w:rPr>
+        <w:t xml:space="preserve">  </w:t>
+      </w:r>
+      <w:r>
+        <w:rPr>
+          <w:rStyle w:val="AttributeTok"/>
+        </w:rPr>
+        <w:t xml:space="preserve">col =</w:t>
+      </w:r>
+      <w:r>
+        <w:rPr>
+          <w:rStyle w:val="NormalTok"/>
+        </w:rPr>
+        <w:t xml:space="preserve"> </w:t>
+      </w:r>
+      <w:r>
+        <w:rPr>
+          <w:rStyle w:val="StringTok"/>
+        </w:rPr>
+        <w:t xml:space="preserve">"#4B8FE022"</w:t>
+      </w:r>
+      <w:r>
+        <w:rPr>
+          <w:rStyle w:val="NormalTok"/>
+        </w:rPr>
+        <w:t xml:space="preserve">, </w:t>
+      </w:r>
+      <w:r>
+        <w:rPr>
+          <w:rStyle w:val="AttributeTok"/>
+        </w:rPr>
+        <w:t xml:space="preserve">border =</w:t>
+      </w:r>
+      <w:r>
+        <w:rPr>
+          <w:rStyle w:val="NormalTok"/>
+        </w:rPr>
+        <w:t xml:space="preserve"> </w:t>
+      </w:r>
+      <w:r>
+        <w:rPr>
+          <w:rStyle w:val="ConstantTok"/>
+        </w:rPr>
+        <w:t xml:space="preserve">NA</w:t>
+      </w:r>
+      <w:r>
+        <w:br/>
+      </w:r>
+      <w:r>
+        <w:rPr>
+          <w:rStyle w:val="NormalTok"/>
+        </w:rPr>
+        <w:t xml:space="preserve">)</w:t>
+      </w:r>
+      <w:r>
+        <w:br/>
+      </w:r>
+      <w:r>
+        <w:rPr>
+          <w:rStyle w:val="FunctionTok"/>
+        </w:rPr>
+        <w:t xml:space="preserve">lines</w:t>
+      </w:r>
+      <w:r>
+        <w:rPr>
+          <w:rStyle w:val="NormalTok"/>
+        </w:rPr>
+        <w:t xml:space="preserve">(boot</w:t>
+      </w:r>
+      <w:r>
+        <w:rPr>
+          <w:rStyle w:val="SpecialCharTok"/>
+        </w:rPr>
+        <w:t xml:space="preserve">$</w:t>
+      </w:r>
+      <w:r>
+        <w:rPr>
+          <w:rStyle w:val="NormalTok"/>
+        </w:rPr>
+        <w:t xml:space="preserve">month, boot</w:t>
+      </w:r>
+      <w:r>
+        <w:rPr>
+          <w:rStyle w:val="SpecialCharTok"/>
+        </w:rPr>
+        <w:t xml:space="preserve">$</w:t>
+      </w:r>
+      <w:r>
+        <w:rPr>
+          <w:rStyle w:val="NormalTok"/>
+        </w:rPr>
+        <w:t xml:space="preserve">diff, </w:t>
+      </w:r>
+      <w:r>
+        <w:rPr>
+          <w:rStyle w:val="AttributeTok"/>
+        </w:rPr>
+        <w:t xml:space="preserve">col =</w:t>
+      </w:r>
+      <w:r>
+        <w:rPr>
+          <w:rStyle w:val="NormalTok"/>
+        </w:rPr>
+        <w:t xml:space="preserve"> </w:t>
+      </w:r>
+      <w:r>
+        <w:rPr>
+          <w:rStyle w:val="StringTok"/>
+        </w:rPr>
+        <w:t xml:space="preserve">"#222222"</w:t>
+      </w:r>
+      <w:r>
+        <w:rPr>
+          <w:rStyle w:val="NormalTok"/>
+        </w:rPr>
+        <w:t xml:space="preserve">, </w:t>
+      </w:r>
+      <w:r>
+        <w:rPr>
+          <w:rStyle w:val="AttributeTok"/>
+        </w:rPr>
+        <w:t xml:space="preserve">lwd =</w:t>
+      </w:r>
+      <w:r>
+        <w:rPr>
+          <w:rStyle w:val="NormalTok"/>
+        </w:rPr>
+        <w:t xml:space="preserve"> </w:t>
+      </w:r>
+      <w:r>
+        <w:rPr>
+          <w:rStyle w:val="DecValTok"/>
+        </w:rPr>
+        <w:t xml:space="preserve">2</w:t>
+      </w:r>
+      <w:r>
+        <w:rPr>
+          <w:rStyle w:val="NormalTok"/>
+        </w:rPr>
+        <w:t xml:space="preserve">)</w:t>
+      </w:r>
+    </w:p>
+    <w:tbl>
+      <w:tblPr>
+        <w:tblStyle w:val="Table"/>
+        <w:tblW w:type="pct" w:w="5000"/>
+        <w:tblLayout w:type="fixed"/>
+        <w:tblLook w:firstRow="0" w:lastRow="0" w:firstColumn="0" w:lastColumn="0" w:noHBand="0" w:noVBand="0" w:val="0000"/>
+      </w:tblPr>
+      <w:tblGrid>
+        <w:gridCol w:w="7920"/>
+      </w:tblGrid>
+      <w:tr>
+        <w:tc>
+          <w:tcPr/>
+          <w:bookmarkStart w:id="44" w:name="fig-boot-diff"/>
+          <w:p>
+            <w:pPr>
+              <w:pStyle w:val="Compact"/>
+              <w:jc w:val="center"/>
+            </w:pPr>
+            <w:r>
+              <w:drawing>
+                <wp:inline>
+                  <wp:extent cx="5334000" cy="3809999"/>
+                  <wp:effectExtent b="0" l="0" r="0" t="0"/>
+                  <wp:docPr descr="" title="" id="42" name="Picture"/>
+                  <a:graphic>
+                    <a:graphicData uri="http://schemas.openxmlformats.org/drawingml/2006/picture">
+                      <pic:pic>
+                        <pic:nvPicPr>
+                          <pic:cNvPr descr="using-ettbc_files/figure-docx/fig-boot-diff-1.png" id="43" name="Picture"/>
+                          <pic:cNvPicPr>
+                            <a:picLocks noChangeArrowheads="1" noChangeAspect="1"/>
+                          </pic:cNvPicPr>
+                        </pic:nvPicPr>
+                        <pic:blipFill>
+                          <a:blip r:embed="rId41"/>
+                          <a:stretch>
+                            <a:fillRect/>
+                          </a:stretch>
+                        </pic:blipFill>
+                        <pic:spPr bwMode="auto">
+                          <a:xfrm>
+                            <a:off x="0" y="0"/>
+                            <a:ext cx="5334000" cy="3809999"/>
+                          </a:xfrm>
+                          <a:prstGeom prst="rect">
+                            <a:avLst/>
+                          </a:prstGeom>
+                          <a:noFill/>
+                          <a:ln w="9525">
+                            <a:noFill/>
+                            <a:headEnd/>
+                            <a:tailEnd/>
+                          </a:ln>
+                        </pic:spPr>
+                      </pic:pic>
+                    </a:graphicData>
+                  </a:graphic>
+                </wp:inline>
+              </w:drawing>
+            </w:r>
+          </w:p>
+          <w:p>
+            <w:pPr>
+              <w:jc w:val="center"/>
+            </w:pPr>
+            <w:pPr>
+              <w:jc w:val="left"/>
+              <w:spacing w:before="200"/>
+              <w:pStyle w:val="ImageCaption"/>
+            </w:pPr>
+            <w:r>
+              <w:t xml:space="preserve">Figure 5: Bootstrap survival difference (CONTINUE minus STOPBASE) with a 95 percent percentile confidence band. The band covers zero throughout, the expected null.</w:t>
+            </w:r>
+          </w:p>
+          <w:bookmarkEnd w:id="44"/>
+        </w:tc>
+      </w:tr>
+    </w:tbl>
+    <w:bookmarkEnd w:id="45"/>
+    <w:bookmarkStart w:id="48" w:name="summary"/>
+    <w:p>
+      <w:pPr>
+        <w:pStyle w:val="Heading2"/>
+      </w:pPr>
+      <w:r>
+        <w:t xml:space="preserve">11 Summary</w:t>
+      </w:r>
+    </w:p>
+    <w:p>
+      <w:pPr>
+        <w:pStyle w:val="FirstParagraph"/>
+      </w:pPr>
+      <w:r>
+        <w:t xml:space="preserve">The</w:t>
+      </w:r>
+      <w:r>
+        <w:t xml:space="preserve"> </w:t>
+      </w:r>
+      <w:r>
+        <w:rPr>
+          <w:rStyle w:val="VerbatimChar"/>
+        </w:rPr>
+        <w:t xml:space="preserve">{ettbc}</w:t>
+      </w:r>
+      <w:r>
+        <w:t xml:space="preserve"> </w:t>
+      </w:r>
+      <w:r>
+        <w:t xml:space="preserve">package implements the full clone-censor-reweight pipeline:</w:t>
+      </w:r>
+    </w:p>
+    <w:tbl>
+      <w:tblPr>
+        <w:tblStyle w:val="Table"/>
+        <w:tblW w:type="pct" w:w="5000"/>
+        <w:tblLayout w:type="fixed"/>
+        <w:tblLook w:firstRow="0" w:lastRow="0" w:firstColumn="0" w:lastColumn="0" w:noHBand="0" w:noVBand="0" w:val="0000"/>
+      </w:tblPr>
+      <w:tblGrid>
+        <w:gridCol w:w="7920"/>
+      </w:tblGrid>
+      <w:tr>
+        <w:tc>
+          <w:tcPr/>
+          <w:bookmarkStart w:id="46" w:name="tbl-functions"/>
           <w:p>
             <w:pPr>
               <w:jc w:val="center"/>
@@ -4768,6 +8070,519 @@
             </w:pPr>
             <w:r>
               <w:t xml:space="preserve">Table 1: Core ettbc functions</w:t>
+            </w:r>
+          </w:p>
+          <w:tbl>
+            <w:tblPr>
+              <w:tblStyle w:val="Table"/>
+              <w:tblW w:type="pct" w:w="5000"/>
+              <w:tblLayout w:type="fixed"/>
+              <w:tblLook w:firstRow="1" w:lastRow="0" w:firstColumn="0" w:lastColumn="0" w:noHBand="0" w:noVBand="0" w:val="0020"/>
+            </w:tblPr>
+            <w:tblGrid>
+              <w:gridCol w:w="2640"/>
+              <w:gridCol w:w="2640"/>
+              <w:gridCol w:w="2640"/>
+            </w:tblGrid>
+            <w:tr>
+              <w:trPr>
+                <w:tblHeader w:val="on"/>
+              </w:trPr>
+              <w:tc>
+                <w:tcPr/>
+                <w:p>
+                  <w:pPr>
+                    <w:pStyle w:val="Compact"/>
+                    <w:jc w:val="center"/>
+                  </w:pPr>
+                  <w:r>
+                    <w:t xml:space="preserve">Function</w:t>
+                  </w:r>
+                </w:p>
+              </w:tc>
+              <w:tc>
+                <w:tcPr/>
+                <w:p>
+                  <w:pPr>
+                    <w:pStyle w:val="Compact"/>
+                    <w:jc w:val="center"/>
+                  </w:pPr>
+                  <w:r>
+                    <w:t xml:space="preserve">Input</w:t>
+                  </w:r>
+                </w:p>
+              </w:tc>
+              <w:tc>
+                <w:tcPr/>
+                <w:p>
+                  <w:pPr>
+                    <w:pStyle w:val="Compact"/>
+                    <w:jc w:val="center"/>
+                  </w:pPr>
+                  <w:r>
+                    <w:t xml:space="preserve">Output</w:t>
+                  </w:r>
+                </w:p>
+              </w:tc>
+            </w:tr>
+            <w:tr>
+              <w:tc>
+                <w:tcPr/>
+                <w:p>
+                  <w:pPr>
+                    <w:pStyle w:val="Compact"/>
+                    <w:jc w:val="center"/>
+                  </w:pPr>
+                  <w:r>
+                    <w:rPr>
+                      <w:rStyle w:val="VerbatimChar"/>
+                    </w:rPr>
+                    <w:t xml:space="preserve">simulate_screening_cohort()</w:t>
+                  </w:r>
+                </w:p>
+              </w:tc>
+              <w:tc>
+                <w:tcPr/>
+                <w:p>
+                  <w:pPr>
+                    <w:pStyle w:val="Compact"/>
+                    <w:jc w:val="center"/>
+                  </w:pPr>
+                  <w:r>
+                    <w:t xml:space="preserve">cohort size</w:t>
+                  </w:r>
+                </w:p>
+              </w:tc>
+              <w:tc>
+                <w:tcPr/>
+                <w:p>
+                  <w:pPr>
+                    <w:pStyle w:val="Compact"/>
+                    <w:jc w:val="center"/>
+                  </w:pPr>
+                  <w:r>
+                    <w:t xml:space="preserve">three linked synthetic tables</w:t>
+                  </w:r>
+                </w:p>
+              </w:tc>
+            </w:tr>
+            <w:tr>
+              <w:tc>
+                <w:tcPr/>
+                <w:p>
+                  <w:pPr>
+                    <w:pStyle w:val="Compact"/>
+                    <w:jc w:val="center"/>
+                  </w:pPr>
+                  <w:r>
+                    <w:rPr>
+                      <w:rStyle w:val="VerbatimChar"/>
+                    </w:rPr>
+                    <w:t xml:space="preserve">clone_censor()</w:t>
+                  </w:r>
+                </w:p>
+              </w:tc>
+              <w:tc>
+                <w:tcPr/>
+                <w:p>
+                  <w:pPr>
+                    <w:pStyle w:val="Compact"/>
+                    <w:jc w:val="center"/>
+                  </w:pPr>
+                  <w:r>
+                    <w:t xml:space="preserve">cohort + mammogram events</w:t>
+                  </w:r>
+                </w:p>
+              </w:tc>
+              <w:tc>
+                <w:tcPr/>
+                <w:p>
+                  <w:pPr>
+                    <w:pStyle w:val="Compact"/>
+                    <w:jc w:val="center"/>
+                  </w:pPr>
+                  <w:r>
+                    <w:t xml:space="preserve">two rows per participant</w:t>
+                  </w:r>
+                </w:p>
+              </w:tc>
+            </w:tr>
+            <w:tr>
+              <w:tc>
+                <w:tcPr/>
+                <w:p>
+                  <w:pPr>
+                    <w:pStyle w:val="Compact"/>
+                    <w:jc w:val="center"/>
+                  </w:pPr>
+                  <w:r>
+                    <w:rPr>
+                      <w:rStyle w:val="VerbatimChar"/>
+                    </w:rPr>
+                    <w:t xml:space="preserve">expand_to_long()</w:t>
+                  </w:r>
+                </w:p>
+              </w:tc>
+              <w:tc>
+                <w:tcPr/>
+                <w:p>
+                  <w:pPr>
+                    <w:pStyle w:val="Compact"/>
+                    <w:jc w:val="center"/>
+                  </w:pPr>
+                  <w:r>
+                    <w:t xml:space="preserve">cloned dataset</w:t>
+                  </w:r>
+                </w:p>
+              </w:tc>
+              <w:tc>
+                <w:tcPr/>
+                <w:p>
+                  <w:pPr>
+                    <w:pStyle w:val="Compact"/>
+                    <w:jc w:val="center"/>
+                  </w:pPr>
+                  <w:r>
+                    <w:t xml:space="preserve">one row per participant-arm-month</w:t>
+                  </w:r>
+                </w:p>
+              </w:tc>
+            </w:tr>
+            <w:tr>
+              <w:tc>
+                <w:tcPr/>
+                <w:p>
+                  <w:pPr>
+                    <w:pStyle w:val="Compact"/>
+                    <w:jc w:val="center"/>
+                  </w:pPr>
+                  <w:r>
+                    <w:rPr>
+                      <w:rStyle w:val="VerbatimChar"/>
+                    </w:rPr>
+                    <w:t xml:space="preserve">augment_long_covariates()</w:t>
+                  </w:r>
+                </w:p>
+              </w:tc>
+              <w:tc>
+                <w:tcPr/>
+                <w:p>
+                  <w:pPr>
+                    <w:pStyle w:val="Compact"/>
+                    <w:jc w:val="center"/>
+                  </w:pPr>
+                  <w:r>
+                    <w:t xml:space="preserve">long dataset + events</w:t>
+                  </w:r>
+                </w:p>
+              </w:tc>
+              <w:tc>
+                <w:tcPr/>
+                <w:p>
+                  <w:pPr>
+                    <w:pStyle w:val="Compact"/>
+                    <w:jc w:val="center"/>
+                  </w:pPr>
+                  <w:r>
+                    <w:t xml:space="preserve">time-varying screening covariates</w:t>
+                  </w:r>
+                </w:p>
+              </w:tc>
+            </w:tr>
+            <w:tr>
+              <w:tc>
+                <w:tcPr/>
+                <w:p>
+                  <w:pPr>
+                    <w:pStyle w:val="Compact"/>
+                    <w:jc w:val="center"/>
+                  </w:pPr>
+                  <w:r>
+                    <w:rPr>
+                      <w:rStyle w:val="VerbatimChar"/>
+                    </w:rPr>
+                    <w:t xml:space="preserve">fit_screening_propensity()</w:t>
+                  </w:r>
+                </w:p>
+              </w:tc>
+              <w:tc>
+                <w:tcPr/>
+                <w:p>
+                  <w:pPr>
+                    <w:pStyle w:val="Compact"/>
+                    <w:jc w:val="center"/>
+                  </w:pPr>
+                  <w:r>
+                    <w:t xml:space="preserve">augmented long dataset</w:t>
+                  </w:r>
+                </w:p>
+              </w:tc>
+              <w:tc>
+                <w:tcPr/>
+                <w:p>
+                  <w:pPr>
+                    <w:pStyle w:val="Compact"/>
+                    <w:jc w:val="center"/>
+                  </w:pPr>
+                  <w:r>
+                    <w:t xml:space="preserve">screening probabilities</w:t>
+                  </w:r>
+                </w:p>
+              </w:tc>
+            </w:tr>
+            <w:tr>
+              <w:tc>
+                <w:tcPr/>
+                <w:p>
+                  <w:pPr>
+                    <w:pStyle w:val="Compact"/>
+                    <w:jc w:val="center"/>
+                  </w:pPr>
+                  <w:r>
+                    <w:rPr>
+                      <w:rStyle w:val="VerbatimChar"/>
+                    </w:rPr>
+                    <w:t xml:space="preserve">compute_ipw_weights()</w:t>
+                  </w:r>
+                </w:p>
+              </w:tc>
+              <w:tc>
+                <w:tcPr/>
+                <w:p>
+                  <w:pPr>
+                    <w:pStyle w:val="Compact"/>
+                    <w:jc w:val="center"/>
+                  </w:pPr>
+                  <w:r>
+                    <w:t xml:space="preserve">long dataset + probabilities</w:t>
+                  </w:r>
+                </w:p>
+              </w:tc>
+              <w:tc>
+                <w:tcPr/>
+                <w:p>
+                  <w:pPr>
+                    <w:pStyle w:val="Compact"/>
+                    <w:jc w:val="center"/>
+                  </w:pPr>
+                  <w:r>
+                    <w:t xml:space="preserve">stabilized IPW weights</w:t>
+                  </w:r>
+                </w:p>
+              </w:tc>
+            </w:tr>
+            <w:tr>
+              <w:tc>
+                <w:tcPr/>
+                <w:p>
+                  <w:pPr>
+                    <w:pStyle w:val="Compact"/>
+                    <w:jc w:val="center"/>
+                  </w:pPr>
+                  <w:r>
+                    <w:rPr>
+                      <w:rStyle w:val="VerbatimChar"/>
+                    </w:rPr>
+                    <w:t xml:space="preserve">fit_outcome_hr()</w:t>
+                  </w:r>
+                </w:p>
+              </w:tc>
+              <w:tc>
+                <w:tcPr/>
+                <w:p>
+                  <w:pPr>
+                    <w:pStyle w:val="Compact"/>
+                    <w:jc w:val="center"/>
+                  </w:pPr>
+                  <w:r>
+                    <w:t xml:space="preserve">weighted long dataset</w:t>
+                  </w:r>
+                </w:p>
+              </w:tc>
+              <w:tc>
+                <w:tcPr/>
+                <w:p>
+                  <w:pPr>
+                    <w:pStyle w:val="Compact"/>
+                    <w:jc w:val="center"/>
+                  </w:pPr>
+                  <w:r>
+                    <w:t xml:space="preserve">arm hazard ratio</w:t>
+                  </w:r>
+                </w:p>
+              </w:tc>
+            </w:tr>
+            <w:tr>
+              <w:tc>
+                <w:tcPr/>
+                <w:p>
+                  <w:pPr>
+                    <w:pStyle w:val="Compact"/>
+                    <w:jc w:val="center"/>
+                  </w:pPr>
+                  <w:r>
+                    <w:rPr>
+                      <w:rStyle w:val="VerbatimChar"/>
+                    </w:rPr>
+                    <w:t xml:space="preserve">predict_survival_ipw()</w:t>
+                  </w:r>
+                </w:p>
+              </w:tc>
+              <w:tc>
+                <w:tcPr/>
+                <w:p>
+                  <w:pPr>
+                    <w:pStyle w:val="Compact"/>
+                    <w:jc w:val="center"/>
+                  </w:pPr>
+                  <w:r>
+                    <w:t xml:space="preserve">weighted long dataset</w:t>
+                  </w:r>
+                </w:p>
+              </w:tc>
+              <w:tc>
+                <w:tcPr/>
+                <w:p>
+                  <w:pPr>
+                    <w:pStyle w:val="Compact"/>
+                    <w:jc w:val="center"/>
+                  </w:pPr>
+                  <w:r>
+                    <w:t xml:space="preserve">marginal survival curves</w:t>
+                  </w:r>
+                </w:p>
+              </w:tc>
+            </w:tr>
+            <w:tr>
+              <w:tc>
+                <w:tcPr/>
+                <w:p>
+                  <w:pPr>
+                    <w:pStyle w:val="Compact"/>
+                    <w:jc w:val="center"/>
+                  </w:pPr>
+                  <w:r>
+                    <w:rPr>
+                      <w:rStyle w:val="VerbatimChar"/>
+                    </w:rPr>
+                    <w:t xml:space="preserve">bootstrap_ci()</w:t>
+                  </w:r>
+                </w:p>
+              </w:tc>
+              <w:tc>
+                <w:tcPr/>
+                <w:p>
+                  <w:pPr>
+                    <w:pStyle w:val="Compact"/>
+                    <w:jc w:val="center"/>
+                  </w:pPr>
+                  <w:r>
+                    <w:t xml:space="preserve">long dataset + probabilities</w:t>
+                  </w:r>
+                </w:p>
+              </w:tc>
+              <w:tc>
+                <w:tcPr/>
+                <w:p>
+                  <w:pPr>
+                    <w:pStyle w:val="Compact"/>
+                    <w:jc w:val="center"/>
+                  </w:pPr>
+                  <w:r>
+                    <w:t xml:space="preserve">survival difference with CI</w:t>
+                  </w:r>
+                </w:p>
+              </w:tc>
+            </w:tr>
+          </w:tbl>
+          <w:bookmarkEnd w:id="46"/>
+          <w:p/>
+        </w:tc>
+      </w:tr>
+    </w:tbl>
+    <w:p>
+      <w:pPr>
+        <w:pStyle w:val="BodyText"/>
+      </w:pPr>
+      <w:r>
+        <w:t xml:space="preserve">Run on the synthetic cohort, the pipeline recovers the null effect the</w:t>
+      </w:r>
+      <w:r>
+        <w:t xml:space="preserve"> </w:t>
+      </w:r>
+      <w:r>
+        <w:t xml:space="preserve">simulation was built with. Pointed at a real Medicare cohort with the paper’s</w:t>
+      </w:r>
+      <w:r>
+        <w:t xml:space="preserve"> </w:t>
+      </w:r>
+      <w:r>
+        <w:t xml:space="preserve">full covariate set, the same functions reproduce the substantive analysis of</w:t>
+      </w:r>
+      <w:r>
+        <w:t xml:space="preserve"> </w:t>
+      </w:r>
+      <w:r>
+        <w:t xml:space="preserve">García-Albéniz et al. (2020)</w:t>
+      </w:r>
+      <w:r>
+        <w:t xml:space="preserve">.</w:t>
+      </w:r>
+    </w:p>
+    <w:p>
+      <w:pPr>
+        <w:pStyle w:val="BodyText"/>
+      </w:pPr>
+      <w:r>
+        <w:t xml:space="preserve">The</w:t>
+      </w:r>
+      <w:r>
+        <w:t xml:space="preserve"> </w:t>
+      </w:r>
+      <w:r>
+        <w:rPr>
+          <w:rStyle w:val="VerbatimChar"/>
+        </w:rPr>
+        <w:t xml:space="preserve">{ettbc}</w:t>
+      </w:r>
+      <w:r>
+        <w:t xml:space="preserve"> </w:t>
+      </w:r>
+      <w:r>
+        <w:t xml:space="preserve">package provides two core functions for the clone-censor step</w:t>
+      </w:r>
+      <w:r>
+        <w:t xml:space="preserve"> </w:t>
+      </w:r>
+      <w:r>
+        <w:t xml:space="preserve">of target trial emulation:</w:t>
+      </w:r>
+    </w:p>
+    <w:tbl>
+      <w:tblPr>
+        <w:tblStyle w:val="Table"/>
+        <w:tblW w:type="pct" w:w="5000"/>
+        <w:tblLayout w:type="fixed"/>
+        <w:tblLook w:firstRow="0" w:lastRow="0" w:firstColumn="0" w:lastColumn="0" w:noHBand="0" w:noVBand="0" w:val="0000"/>
+      </w:tblPr>
+      <w:tblGrid>
+        <w:gridCol w:w="7920"/>
+      </w:tblGrid>
+      <w:tr>
+        <w:tc>
+          <w:tcPr/>
+          <w:bookmarkStart w:id="47" w:name="tbl-functions"/>
+          <w:p>
+            <w:pPr>
+              <w:jc w:val="center"/>
+            </w:pPr>
+            <w:pPr>
+              <w:jc w:val="left"/>
+              <w:spacing w:before="200"/>
+              <w:pStyle w:val="ImageCaption"/>
+            </w:pPr>
+            <w:r>
+              <w:t xml:space="preserve">Table 2: Core ettbc functions</w:t>
             </w:r>
           </w:p>
           <w:tbl>
@@ -4906,7 +8721,7 @@
               </w:tc>
             </w:tr>
           </w:tbl>
-          <w:bookmarkEnd w:id="33"/>
+          <w:bookmarkEnd w:id="47"/>
           <w:p/>
         </w:tc>
       </w:tr>
@@ -4941,18 +8756,18 @@
         <w:t xml:space="preserve">effect of each screening strategy.</w:t>
       </w:r>
     </w:p>
-    <w:bookmarkEnd w:id="34"/>
-    <w:bookmarkStart w:id="40" w:name="references"/>
+    <w:bookmarkEnd w:id="48"/>
+    <w:bookmarkStart w:id="54" w:name="references"/>
     <w:p>
       <w:pPr>
         <w:pStyle w:val="Heading2"/>
       </w:pPr>
       <w:r>
-        <w:t xml:space="preserve">7 References</w:t>
+        <w:t xml:space="preserve">12 References</w:t>
       </w:r>
     </w:p>
-    <w:bookmarkStart w:id="39" w:name="refs"/>
-    <w:bookmarkStart w:id="36" w:name="ref-garcia-albeniz2020"/>
+    <w:bookmarkStart w:id="53" w:name="refs"/>
+    <w:bookmarkStart w:id="50" w:name="ref-garcia-albeniz2020"/>
     <w:p>
       <w:pPr>
         <w:pStyle w:val="Bibliography"/>
@@ -4985,7 +8800,7 @@
       <w:r>
         <w:t xml:space="preserve"> </w:t>
       </w:r>
-      <w:hyperlink r:id="rId35">
+      <w:hyperlink r:id="rId49">
         <w:r>
           <w:rPr>
             <w:rStyle w:val="Hyperlink"/>
@@ -4997,8 +8812,8 @@
         <w:t xml:space="preserve">.</w:t>
       </w:r>
     </w:p>
-    <w:bookmarkEnd w:id="36"/>
-    <w:bookmarkStart w:id="38" w:name="ref-hernan2016"/>
+    <w:bookmarkEnd w:id="50"/>
+    <w:bookmarkStart w:id="52" w:name="ref-hernan2016"/>
     <w:p>
       <w:pPr>
         <w:pStyle w:val="Bibliography"/>
@@ -5031,7 +8846,7 @@
       <w:r>
         <w:t xml:space="preserve"> </w:t>
       </w:r>
-      <w:hyperlink r:id="rId37">
+      <w:hyperlink r:id="rId51">
         <w:r>
           <w:rPr>
             <w:rStyle w:val="Hyperlink"/>
@@ -5043,9 +8858,9 @@
         <w:t xml:space="preserve">.</w:t>
       </w:r>
     </w:p>
-    <w:bookmarkEnd w:id="38"/>
-    <w:bookmarkEnd w:id="39"/>
-    <w:bookmarkEnd w:id="40"/>
+    <w:bookmarkEnd w:id="52"/>
+    <w:bookmarkEnd w:id="53"/>
+    <w:bookmarkEnd w:id="54"/>
     <w:sectPr>
       <w:footnotePr>
         <w:numRestart w:val="eachSect"/>

</xml_diff>